<commit_message>
Update Sprint Backlog document
</commit_message>
<xml_diff>
--- a/Scrum_Management/G3_SprintBacklog.docx
+++ b/Scrum_Management/G3_SprintBacklog.docx
@@ -3,9 +3,2871 @@
 <w:document xmlns:wpc="http://schemas.microsoft.com/office/word/2010/wordprocessingCanvas" xmlns:cx="http://schemas.microsoft.com/office/drawing/2014/chartex" xmlns:cx1="http://schemas.microsoft.com/office/drawing/2015/9/8/chartex" xmlns:cx2="http://schemas.microsoft.com/office/drawing/2015/10/21/chartex" xmlns:cx3="http://schemas.microsoft.com/office/drawing/2016/5/9/chartex" xmlns:cx4="http://schemas.microsoft.com/office/drawing/2016/5/10/chartex" xmlns:cx5="http://schemas.microsoft.com/office/drawing/2016/5/11/chartex" xmlns:cx6="http://schemas.microsoft.com/office/drawing/2016/5/12/chartex" xmlns:cx7="http://schemas.microsoft.com/office/drawing/2016/5/13/chartex" xmlns:cx8="http://schemas.microsoft.com/office/drawing/2016/5/14/chartex" xmlns:mc="http://schemas.openxmlformats.org/markup-compatibility/2006" xmlns:aink="http://schemas.microsoft.com/office/drawing/2016/ink" xmlns:am3d="http://schemas.microsoft.com/office/drawing/2017/model3d" xmlns:o="urn:schemas-microsoft-com:office:office" xmlns:oel="http://schemas.microsoft.com/office/2019/extlst" xmlns:r="http://schemas.openxmlformats.org/officeDocument/2006/relationships" xmlns:m="http://schemas.openxmlformats.org/officeDocument/2006/math" xmlns:v="urn:schemas-microsoft-com:vml" xmlns:wp14="http://schemas.microsoft.com/office/word/2010/wordprocessingDrawing" xmlns:wp="http://schemas.openxmlformats.org/drawingml/2006/wordprocessingDrawing" xmlns:w10="urn:schemas-microsoft-com:office:word" xmlns:w="http://schemas.openxmlformats.org/wordprocessingml/2006/main" xmlns:w14="http://schemas.microsoft.com/office/word/2010/wordml" xmlns:w15="http://schemas.microsoft.com/office/word/2012/wordml" xmlns:w16cex="http://schemas.microsoft.com/office/word/2018/wordml/cex" xmlns:w16cid="http://schemas.microsoft.com/office/word/2016/wordml/cid" xmlns:w16="http://schemas.microsoft.com/office/word/2018/wordml" xmlns:w16du="http://schemas.microsoft.com/office/word/2023/wordml/word16du" xmlns:w16sdtdh="http://schemas.microsoft.com/office/word/2020/wordml/sdtdatahash" xmlns:w16sdtfl="http://schemas.microsoft.com/office/word/2024/wordml/sdtformatlock" xmlns:w16se="http://schemas.microsoft.com/office/word/2015/wordml/symex" xmlns:wpg="http://schemas.microsoft.com/office/word/2010/wordprocessingGroup" xmlns:wpi="http://schemas.microsoft.com/office/word/2010/wordprocessingInk" xmlns:wne="http://schemas.microsoft.com/office/word/2006/wordml" xmlns:wps="http://schemas.microsoft.com/office/word/2010/wordprocessingShape" mc:Ignorable="w14 w15 w16se w16cid w16 w16cex w16sdtdh w16sdtfl w16du wp14">
   <w:body>
     <w:p>
-      <w:r>
-        <w:t>SCRUM</w:t>
-      </w:r>
+      <w:pPr>
+        <w:bidi w:val="0"/>
+        <w:jc w:val="center"/>
+        <w:rPr>
+          <w:rFonts w:ascii="Calibri" w:hAnsi="Calibri" w:cs="Calibri"/>
+          <w:b/>
+          <w:bCs/>
+          <w:sz w:val="32"/>
+          <w:szCs w:val="32"/>
+          <w:u w:val="single"/>
+        </w:rPr>
+      </w:pPr>
+      <w:r>
+        <w:rPr>
+          <w:rFonts w:ascii="Calibri" w:hAnsi="Calibri" w:cs="Calibri"/>
+          <w:b/>
+          <w:bCs/>
+          <w:sz w:val="32"/>
+          <w:szCs w:val="32"/>
+          <w:u w:val="single"/>
+        </w:rPr>
+        <w:t>SPRINT BACKLOG</w:t>
+      </w:r>
+      <w:r>
+        <w:rPr>
+          <w:rFonts w:ascii="Calibri" w:hAnsi="Calibri" w:cs="Calibri"/>
+          <w:b/>
+          <w:bCs/>
+          <w:sz w:val="32"/>
+          <w:szCs w:val="32"/>
+          <w:u w:val="single"/>
+        </w:rPr>
+        <w:t xml:space="preserve"> </w:t>
+      </w:r>
+      <w:r>
+        <w:rPr>
+          <w:rFonts w:ascii="Calibri" w:hAnsi="Calibri" w:cs="Calibri"/>
+          <w:b/>
+          <w:bCs/>
+          <w:sz w:val="32"/>
+          <w:szCs w:val="32"/>
+          <w:u w:val="single"/>
+        </w:rPr>
+        <w:t>(First Prototype)</w:t>
+      </w:r>
+    </w:p>
+    <w:p>
+      <w:pPr>
+        <w:bidi w:val="0"/>
+        <w:jc w:val="center"/>
+        <w:rPr>
+          <w:rFonts w:ascii="Calibri" w:hAnsi="Calibri" w:cs="Calibri"/>
+          <w:b/>
+          <w:bCs/>
+          <w:sz w:val="32"/>
+          <w:szCs w:val="32"/>
+          <w:u w:val="single"/>
+        </w:rPr>
+      </w:pPr>
+      <w:proofErr w:type="spellStart"/>
+      <w:r>
+        <w:rPr>
+          <w:rFonts w:ascii="Calibri" w:hAnsi="Calibri" w:cs="Calibri"/>
+          <w:b/>
+          <w:bCs/>
+          <w:sz w:val="32"/>
+          <w:szCs w:val="32"/>
+          <w:u w:val="single"/>
+        </w:rPr>
+        <w:t>ProductLog</w:t>
+      </w:r>
+      <w:proofErr w:type="spellEnd"/>
+    </w:p>
+    <w:p>
+      <w:pPr>
+        <w:bidi w:val="0"/>
+        <w:spacing w:line="240" w:lineRule="auto"/>
+        <w:rPr>
+          <w:rFonts w:ascii="Calibri" w:hAnsi="Calibri" w:cs="Calibri"/>
+          <w:b/>
+          <w:bCs/>
+        </w:rPr>
+      </w:pPr>
+      <w:r>
+        <w:rPr>
+          <w:rFonts w:ascii="Calibri" w:hAnsi="Calibri" w:cs="Calibri"/>
+          <w:b/>
+          <w:bCs/>
+        </w:rPr>
+        <w:t xml:space="preserve">Group: </w:t>
+      </w:r>
+      <w:r>
+        <w:rPr>
+          <w:rFonts w:ascii="Calibri" w:hAnsi="Calibri" w:cs="Calibri"/>
+          <w:b/>
+          <w:bCs/>
+        </w:rPr>
+        <w:t>3</w:t>
+      </w:r>
+    </w:p>
+    <w:p>
+      <w:pPr>
+        <w:bidi w:val="0"/>
+        <w:spacing w:line="240" w:lineRule="auto"/>
+        <w:rPr>
+          <w:rFonts w:ascii="Calibri" w:hAnsi="Calibri" w:cs="Calibri"/>
+          <w:b/>
+          <w:bCs/>
+          <w:rtl/>
+        </w:rPr>
+      </w:pPr>
+      <w:r>
+        <w:rPr>
+          <w:rFonts w:ascii="Calibri" w:hAnsi="Calibri" w:cs="Calibri" w:hint="cs"/>
+          <w:b/>
+          <w:bCs/>
+          <w:rtl/>
+        </w:rPr>
+        <w:t>א</w:t>
+      </w:r>
+      <w:r>
+        <w:rPr>
+          <w:rFonts w:ascii="Calibri" w:hAnsi="Calibri" w:cs="Calibri" w:hint="cs"/>
+          <w:b/>
+          <w:bCs/>
+          <w:rtl/>
+        </w:rPr>
+        <w:t>נה פפיקיאן 324390939</w:t>
+      </w:r>
+      <w:r>
+        <w:rPr>
+          <w:rFonts w:ascii="Calibri" w:hAnsi="Calibri" w:cs="Calibri"/>
+          <w:b/>
+          <w:bCs/>
+          <w:rtl/>
+        </w:rPr>
+        <w:br/>
+      </w:r>
+      <w:hyperlink r:id="rId6" w:history="1">
+        <w:r>
+          <w:rPr>
+            <w:rStyle w:val="Hyperlink"/>
+            <w:rFonts w:ascii="Calibri" w:hAnsi="Calibri" w:cs="Calibri"/>
+            <w:b/>
+            <w:bCs/>
+          </w:rPr>
+          <w:t>Anna.papikyan@braude.ac.il</w:t>
+        </w:r>
+      </w:hyperlink>
+    </w:p>
+    <w:p>
+      <w:pPr>
+        <w:bidi w:val="0"/>
+        <w:spacing w:line="240" w:lineRule="auto"/>
+        <w:rPr>
+          <w:rFonts w:ascii="Calibri" w:hAnsi="Calibri" w:cs="Calibri"/>
+          <w:b/>
+          <w:bCs/>
+          <w:rtl/>
+        </w:rPr>
+      </w:pPr>
+      <w:r>
+        <w:rPr>
+          <w:rFonts w:ascii="Calibri" w:hAnsi="Calibri" w:cs="Calibri" w:hint="cs"/>
+          <w:b/>
+          <w:bCs/>
+          <w:rtl/>
+        </w:rPr>
+        <w:t>ליאור גינת 211879804</w:t>
+      </w:r>
+      <w:r>
+        <w:rPr>
+          <w:rFonts w:ascii="Calibri" w:hAnsi="Calibri" w:cs="Calibri"/>
+          <w:b/>
+          <w:bCs/>
+          <w:rtl/>
+        </w:rPr>
+        <w:br/>
+      </w:r>
+      <w:hyperlink r:id="rId7" w:history="1">
+        <w:r>
+          <w:rPr>
+            <w:rStyle w:val="Hyperlink"/>
+            <w:rFonts w:ascii="Calibri" w:hAnsi="Calibri" w:cs="Calibri"/>
+            <w:b/>
+            <w:bCs/>
+          </w:rPr>
+          <w:t>Lior.ginat@braude.ac.il</w:t>
+        </w:r>
+      </w:hyperlink>
+    </w:p>
+    <w:p>
+      <w:pPr>
+        <w:bidi w:val="0"/>
+        <w:spacing w:line="240" w:lineRule="auto"/>
+        <w:rPr>
+          <w:rFonts w:ascii="Calibri" w:hAnsi="Calibri" w:cs="Calibri"/>
+          <w:b/>
+          <w:bCs/>
+          <w:rtl/>
+        </w:rPr>
+      </w:pPr>
+      <w:r>
+        <w:rPr>
+          <w:rFonts w:ascii="Calibri" w:hAnsi="Calibri" w:cs="Calibri" w:hint="cs"/>
+          <w:b/>
+          <w:bCs/>
+          <w:rtl/>
+        </w:rPr>
+        <w:t>עדי ורשבסקי 209141068</w:t>
+      </w:r>
+      <w:r>
+        <w:rPr>
+          <w:rFonts w:ascii="Calibri" w:hAnsi="Calibri" w:cs="Calibri"/>
+          <w:b/>
+          <w:bCs/>
+          <w:rtl/>
+        </w:rPr>
+        <w:br/>
+      </w:r>
+      <w:hyperlink r:id="rId8" w:history="1">
+        <w:r>
+          <w:rPr>
+            <w:rStyle w:val="Hyperlink"/>
+            <w:rFonts w:ascii="Calibri" w:hAnsi="Calibri" w:cs="Calibri"/>
+            <w:b/>
+            <w:bCs/>
+          </w:rPr>
+          <w:t>Adi.varshavsky@braude.ac.il</w:t>
+        </w:r>
+      </w:hyperlink>
+    </w:p>
+    <w:p>
+      <w:pPr>
+        <w:bidi w:val="0"/>
+        <w:spacing w:line="240" w:lineRule="auto"/>
+        <w:rPr>
+          <w:rFonts w:ascii="Calibri" w:hAnsi="Calibri" w:cs="Calibri"/>
+          <w:b/>
+          <w:bCs/>
+        </w:rPr>
+      </w:pPr>
+      <w:r>
+        <w:rPr>
+          <w:rFonts w:ascii="Calibri" w:hAnsi="Calibri" w:cs="Calibri" w:hint="cs"/>
+          <w:b/>
+          <w:bCs/>
+          <w:rtl/>
+        </w:rPr>
+        <w:t xml:space="preserve">דור שטרן </w:t>
+      </w:r>
+      <w:r>
+        <w:rPr>
+          <w:rFonts w:ascii="Calibri" w:hAnsi="Calibri" w:cs="Calibri" w:hint="cs"/>
+          <w:b/>
+          <w:bCs/>
+          <w:rtl/>
+        </w:rPr>
+        <w:t>322468349</w:t>
+      </w:r>
+      <w:r>
+        <w:rPr>
+          <w:rFonts w:ascii="Calibri" w:hAnsi="Calibri" w:cs="Calibri"/>
+          <w:b/>
+          <w:bCs/>
+          <w:rtl/>
+        </w:rPr>
+        <w:br/>
+      </w:r>
+      <w:hyperlink r:id="rId9" w:history="1">
+        <w:r>
+          <w:rPr>
+            <w:rStyle w:val="Hyperlink"/>
+            <w:rFonts w:ascii="Calibri" w:hAnsi="Calibri" w:cs="Calibri"/>
+            <w:b/>
+            <w:bCs/>
+          </w:rPr>
+          <w:t>Dor.stern@braude.ac.il</w:t>
+        </w:r>
+      </w:hyperlink>
+    </w:p>
+    <w:p>
+      <w:pPr>
+        <w:bidi w:val="0"/>
+        <w:rPr>
+          <w:rFonts w:ascii="Calibri" w:hAnsi="Calibri" w:cs="Calibri"/>
+          <w:b/>
+          <w:bCs/>
+          <w:rtl/>
+        </w:rPr>
+      </w:pPr>
+    </w:p>
+    <w:p>
+      <w:pPr>
+        <w:bidi w:val="0"/>
+        <w:rPr>
+          <w:rFonts w:ascii="Calibri" w:hAnsi="Calibri" w:cs="Calibri"/>
+        </w:rPr>
+      </w:pPr>
+      <w:r>
+        <w:rPr>
+          <w:rFonts w:ascii="Calibri" w:hAnsi="Calibri" w:cs="Calibri"/>
+          <w:b/>
+          <w:bCs/>
+        </w:rPr>
+        <w:t xml:space="preserve">SCRUM master: </w:t>
+      </w:r>
+      <w:r>
+        <w:rPr>
+          <w:rFonts w:ascii="Calibri" w:hAnsi="Calibri" w:cs="Calibri"/>
+        </w:rPr>
+        <w:t>Adi</w:t>
+      </w:r>
+    </w:p>
+    <w:p>
+      <w:pPr>
+        <w:bidi w:val="0"/>
+        <w:rPr>
+          <w:rFonts w:ascii="Calibri" w:hAnsi="Calibri" w:cs="Calibri"/>
+        </w:rPr>
+      </w:pPr>
+      <w:r>
+        <w:rPr>
+          <w:rFonts w:ascii="Calibri" w:hAnsi="Calibri" w:cs="Calibri"/>
+          <w:b/>
+          <w:bCs/>
+        </w:rPr>
+        <w:t xml:space="preserve">Product owner: </w:t>
+      </w:r>
+      <w:r>
+        <w:rPr>
+          <w:rFonts w:ascii="Calibri" w:hAnsi="Calibri" w:cs="Calibri"/>
+        </w:rPr>
+        <w:t>Lior</w:t>
+      </w:r>
+    </w:p>
+    <w:p>
+      <w:pPr>
+        <w:bidi w:val="0"/>
+        <w:rPr>
+          <w:rFonts w:ascii="Calibri" w:hAnsi="Calibri" w:cs="Calibri"/>
+        </w:rPr>
+      </w:pPr>
+      <w:r>
+        <w:rPr>
+          <w:rFonts w:ascii="Calibri" w:hAnsi="Calibri" w:cs="Calibri"/>
+          <w:b/>
+          <w:bCs/>
+        </w:rPr>
+        <w:t>Submit date:</w:t>
+      </w:r>
+      <w:r>
+        <w:rPr>
+          <w:rFonts w:ascii="Calibri" w:hAnsi="Calibri" w:cs="Calibri"/>
+        </w:rPr>
+        <w:t xml:space="preserve"> </w:t>
+      </w:r>
+      <w:r>
+        <w:rPr>
+          <w:rFonts w:ascii="Calibri" w:hAnsi="Calibri" w:cs="Calibri"/>
+        </w:rPr>
+        <w:t>10/05/2026</w:t>
+      </w:r>
+    </w:p>
+    <w:p>
+      <w:pPr>
+        <w:bidi w:val="0"/>
+        <w:rPr>
+          <w:rFonts w:ascii="Calibri" w:hAnsi="Calibri" w:cs="Calibri"/>
+          <w:b/>
+          <w:bCs/>
+        </w:rPr>
+      </w:pPr>
+      <w:r>
+        <w:rPr>
+          <w:rFonts w:ascii="Calibri" w:hAnsi="Calibri" w:cs="Calibri"/>
+          <w:b/>
+          <w:bCs/>
+        </w:rPr>
+        <w:t>Sprint Goals</w:t>
+      </w:r>
+      <w:r>
+        <w:rPr>
+          <w:rFonts w:ascii="Calibri" w:hAnsi="Calibri" w:cs="Calibri"/>
+          <w:b/>
+          <w:bCs/>
+          <w:rtl/>
+        </w:rPr>
+        <w:t>:</w:t>
+      </w:r>
+    </w:p>
+    <w:p>
+      <w:pPr>
+        <w:bidi w:val="0"/>
+        <w:rPr>
+          <w:rFonts w:ascii="Calibri" w:hAnsi="Calibri" w:cs="Calibri"/>
+          <w:sz w:val="22"/>
+          <w:szCs w:val="22"/>
+        </w:rPr>
+      </w:pPr>
+      <w:r>
+        <w:rPr>
+          <w:rFonts w:ascii="Calibri" w:hAnsi="Calibri" w:cs="Calibri"/>
+          <w:sz w:val="22"/>
+          <w:szCs w:val="22"/>
+        </w:rPr>
+        <w:t xml:space="preserve">Complete the system architectural design and deliver a functional Client-Server prototype that enables full CRUD operations (Read &amp; Update) on the "Order" database table via </w:t>
+      </w:r>
+      <w:proofErr w:type="gramStart"/>
+      <w:r>
+        <w:rPr>
+          <w:rFonts w:ascii="Calibri" w:hAnsi="Calibri" w:cs="Calibri"/>
+          <w:sz w:val="22"/>
+          <w:szCs w:val="22"/>
+        </w:rPr>
+        <w:t>a JavaFX</w:t>
+      </w:r>
+      <w:proofErr w:type="gramEnd"/>
+      <w:r>
+        <w:rPr>
+          <w:rFonts w:ascii="Calibri" w:hAnsi="Calibri" w:cs="Calibri"/>
+          <w:sz w:val="22"/>
+          <w:szCs w:val="22"/>
+        </w:rPr>
+        <w:t xml:space="preserve"> GUI.</w:t>
+      </w:r>
+    </w:p>
+    <w:p>
+      <w:pPr>
+        <w:bidi w:val="0"/>
+        <w:rPr>
+          <w:rFonts w:ascii="Calibri" w:hAnsi="Calibri" w:cs="Calibri"/>
+          <w:sz w:val="22"/>
+          <w:szCs w:val="22"/>
+          <w:u w:val="single"/>
+        </w:rPr>
+      </w:pPr>
+      <w:r>
+        <w:rPr>
+          <w:rFonts w:ascii="Calibri" w:hAnsi="Calibri" w:cs="Calibri"/>
+          <w:sz w:val="22"/>
+          <w:szCs w:val="22"/>
+          <w:u w:val="single"/>
+        </w:rPr>
+        <w:t>Assignment</w:t>
+      </w:r>
+      <w:r>
+        <w:rPr>
+          <w:rFonts w:ascii="Calibri" w:hAnsi="Calibri" w:cs="Calibri"/>
+          <w:sz w:val="22"/>
+          <w:szCs w:val="22"/>
+          <w:u w:val="single"/>
+        </w:rPr>
+        <w:t xml:space="preserve"> </w:t>
+      </w:r>
+      <w:r>
+        <w:rPr>
+          <w:rFonts w:ascii="Calibri" w:hAnsi="Calibri" w:cs="Calibri"/>
+          <w:sz w:val="22"/>
+          <w:szCs w:val="22"/>
+          <w:u w:val="single"/>
+        </w:rPr>
+        <w:t>1:</w:t>
+      </w:r>
+    </w:p>
+    <w:tbl>
+      <w:tblPr>
+        <w:tblStyle w:val="af2"/>
+        <w:bidiVisual/>
+        <w:tblW w:w="0" w:type="auto"/>
+        <w:tblLook w:val="04A0" w:firstRow="1" w:lastRow="0" w:firstColumn="1" w:lastColumn="0" w:noHBand="0" w:noVBand="1"/>
+      </w:tblPr>
+      <w:tblGrid>
+        <w:gridCol w:w="2765"/>
+        <w:gridCol w:w="2765"/>
+        <w:gridCol w:w="2766"/>
+      </w:tblGrid>
+      <w:tr>
+        <w:tc>
+          <w:tcPr>
+            <w:tcW w:w="2765" w:type="dxa"/>
+          </w:tcPr>
+          <w:p>
+            <w:pPr>
+              <w:bidi w:val="0"/>
+              <w:rPr>
+                <w:rFonts w:ascii="Calibri" w:hAnsi="Calibri" w:cs="Calibri"/>
+                <w:b/>
+                <w:bCs/>
+                <w:sz w:val="22"/>
+                <w:szCs w:val="22"/>
+                <w:rtl/>
+              </w:rPr>
+            </w:pPr>
+            <w:r>
+              <w:rPr>
+                <w:rFonts w:ascii="Calibri" w:hAnsi="Calibri" w:cs="Calibri"/>
+                <w:b/>
+                <w:bCs/>
+                <w:sz w:val="22"/>
+                <w:szCs w:val="22"/>
+              </w:rPr>
+              <w:t>Status</w:t>
+            </w:r>
+          </w:p>
+        </w:tc>
+        <w:tc>
+          <w:tcPr>
+            <w:tcW w:w="2765" w:type="dxa"/>
+          </w:tcPr>
+          <w:p>
+            <w:pPr>
+              <w:bidi w:val="0"/>
+              <w:rPr>
+                <w:rFonts w:ascii="Calibri" w:hAnsi="Calibri" w:cs="Calibri"/>
+                <w:b/>
+                <w:bCs/>
+                <w:sz w:val="22"/>
+                <w:szCs w:val="22"/>
+                <w:rtl/>
+              </w:rPr>
+            </w:pPr>
+            <w:r>
+              <w:rPr>
+                <w:rFonts w:ascii="Calibri" w:hAnsi="Calibri" w:cs="Calibri"/>
+                <w:b/>
+                <w:bCs/>
+                <w:sz w:val="22"/>
+                <w:szCs w:val="22"/>
+              </w:rPr>
+              <w:t>Assigned To</w:t>
+            </w:r>
+          </w:p>
+        </w:tc>
+        <w:tc>
+          <w:tcPr>
+            <w:tcW w:w="2766" w:type="dxa"/>
+          </w:tcPr>
+          <w:p>
+            <w:pPr>
+              <w:bidi w:val="0"/>
+              <w:rPr>
+                <w:rFonts w:ascii="Calibri" w:hAnsi="Calibri" w:cs="Calibri"/>
+                <w:b/>
+                <w:bCs/>
+                <w:sz w:val="22"/>
+                <w:szCs w:val="22"/>
+                <w:rtl/>
+              </w:rPr>
+            </w:pPr>
+            <w:r>
+              <w:rPr>
+                <w:rFonts w:ascii="Calibri" w:hAnsi="Calibri" w:cs="Calibri"/>
+                <w:b/>
+                <w:bCs/>
+                <w:sz w:val="22"/>
+                <w:szCs w:val="22"/>
+              </w:rPr>
+              <w:t>Task</w:t>
+            </w:r>
+          </w:p>
+        </w:tc>
+      </w:tr>
+      <w:tr>
+        <w:tc>
+          <w:tcPr>
+            <w:tcW w:w="2765" w:type="dxa"/>
+          </w:tcPr>
+          <w:p>
+            <w:pPr>
+              <w:jc w:val="center"/>
+              <w:rPr>
+                <w:rFonts w:ascii="Calibri" w:hAnsi="Calibri" w:cs="Calibri" w:hint="cs"/>
+                <w:sz w:val="22"/>
+                <w:szCs w:val="22"/>
+                <w:rtl/>
+              </w:rPr>
+            </w:pPr>
+            <w:r>
+              <w:rPr>
+                <w:rFonts w:ascii="Calibri" w:hAnsi="Calibri" w:cs="Calibri"/>
+                <w:sz w:val="22"/>
+                <w:szCs w:val="22"/>
+              </w:rPr>
+              <w:t>completed</w:t>
+            </w:r>
+          </w:p>
+        </w:tc>
+        <w:tc>
+          <w:tcPr>
+            <w:tcW w:w="2765" w:type="dxa"/>
+          </w:tcPr>
+          <w:p>
+            <w:pPr>
+              <w:pStyle w:val="p1"/>
+              <w:rPr>
+                <w:rFonts w:ascii="Calibri" w:hAnsi="Calibri" w:cs="Calibri"/>
+                <w:lang w:val="en-US"/>
+              </w:rPr>
+            </w:pPr>
+            <w:r>
+              <w:rPr>
+                <w:rFonts w:ascii="Calibri" w:hAnsi="Calibri" w:cs="Calibri"/>
+                <w:lang w:val="en-US"/>
+              </w:rPr>
+              <w:t>Everyone</w:t>
+            </w:r>
+          </w:p>
+        </w:tc>
+        <w:tc>
+          <w:tcPr>
+            <w:tcW w:w="2766" w:type="dxa"/>
+          </w:tcPr>
+          <w:p>
+            <w:pPr>
+              <w:bidi w:val="0"/>
+              <w:rPr>
+                <w:rFonts w:ascii="Calibri" w:hAnsi="Calibri" w:cs="Calibri"/>
+                <w:sz w:val="22"/>
+                <w:szCs w:val="22"/>
+              </w:rPr>
+            </w:pPr>
+            <w:r>
+              <w:rPr>
+                <w:rFonts w:ascii="Calibri" w:hAnsi="Calibri" w:cs="Calibri"/>
+                <w:sz w:val="22"/>
+                <w:szCs w:val="22"/>
+              </w:rPr>
+              <w:t xml:space="preserve">Creating </w:t>
+            </w:r>
+            <w:r>
+              <w:rPr>
+                <w:rFonts w:ascii="Calibri" w:hAnsi="Calibri" w:cs="Calibri"/>
+                <w:sz w:val="22"/>
+                <w:szCs w:val="22"/>
+              </w:rPr>
+              <w:t>use case</w:t>
+            </w:r>
+            <w:r>
+              <w:rPr>
+                <w:rFonts w:ascii="Calibri" w:hAnsi="Calibri" w:cs="Calibri"/>
+                <w:sz w:val="22"/>
+                <w:szCs w:val="22"/>
+              </w:rPr>
+              <w:t xml:space="preserve"> diagram </w:t>
+            </w:r>
+          </w:p>
+        </w:tc>
+      </w:tr>
+      <w:tr>
+        <w:tc>
+          <w:tcPr>
+            <w:tcW w:w="2765" w:type="dxa"/>
+          </w:tcPr>
+          <w:p>
+            <w:pPr>
+              <w:jc w:val="center"/>
+              <w:rPr>
+                <w:rFonts w:ascii="Calibri" w:hAnsi="Calibri" w:cs="Calibri"/>
+                <w:sz w:val="22"/>
+                <w:szCs w:val="22"/>
+              </w:rPr>
+            </w:pPr>
+            <w:r>
+              <w:rPr>
+                <w:rFonts w:ascii="Calibri" w:hAnsi="Calibri" w:cs="Calibri"/>
+                <w:sz w:val="22"/>
+                <w:szCs w:val="22"/>
+              </w:rPr>
+              <w:t>completed</w:t>
+            </w:r>
+          </w:p>
+        </w:tc>
+        <w:tc>
+          <w:tcPr>
+            <w:tcW w:w="2765" w:type="dxa"/>
+          </w:tcPr>
+          <w:p>
+            <w:pPr>
+              <w:bidi w:val="0"/>
+              <w:rPr>
+                <w:rFonts w:ascii="Calibri" w:hAnsi="Calibri" w:cs="Calibri"/>
+                <w:sz w:val="22"/>
+                <w:szCs w:val="22"/>
+              </w:rPr>
+            </w:pPr>
+            <w:r>
+              <w:rPr>
+                <w:rFonts w:ascii="Calibri" w:hAnsi="Calibri" w:cs="Calibri"/>
+              </w:rPr>
+              <w:t>Everyone</w:t>
+            </w:r>
+          </w:p>
+        </w:tc>
+        <w:tc>
+          <w:tcPr>
+            <w:tcW w:w="2766" w:type="dxa"/>
+          </w:tcPr>
+          <w:p>
+            <w:pPr>
+              <w:pStyle w:val="p1"/>
+              <w:rPr>
+                <w:rFonts w:ascii="Calibri" w:hAnsi="Calibri" w:cs="Calibri"/>
+                <w:lang w:val="en-US"/>
+              </w:rPr>
+            </w:pPr>
+            <w:r>
+              <w:rPr>
+                <w:rFonts w:ascii="Calibri" w:hAnsi="Calibri" w:cs="Calibri"/>
+                <w:sz w:val="22"/>
+                <w:szCs w:val="22"/>
+                <w:lang w:val="en-US"/>
+              </w:rPr>
+              <w:t>Defining</w:t>
+            </w:r>
+            <w:r>
+              <w:rPr>
+                <w:rFonts w:ascii="Calibri" w:hAnsi="Calibri" w:cs="Calibri"/>
+                <w:sz w:val="22"/>
+                <w:szCs w:val="22"/>
+              </w:rPr>
+              <w:t xml:space="preserve"> </w:t>
+            </w:r>
+            <w:r>
+              <w:rPr>
+                <w:rFonts w:ascii="Calibri" w:hAnsi="Calibri" w:cs="Calibri"/>
+                <w:sz w:val="22"/>
+                <w:szCs w:val="22"/>
+                <w:lang w:val="en-US"/>
+              </w:rPr>
+              <w:t>requirements</w:t>
+            </w:r>
+          </w:p>
+        </w:tc>
+      </w:tr>
+      <w:tr>
+        <w:tc>
+          <w:tcPr>
+            <w:tcW w:w="2765" w:type="dxa"/>
+          </w:tcPr>
+          <w:p>
+            <w:pPr>
+              <w:jc w:val="center"/>
+              <w:rPr>
+                <w:rFonts w:ascii="Calibri" w:hAnsi="Calibri" w:cs="Calibri" w:hint="cs"/>
+                <w:sz w:val="22"/>
+                <w:szCs w:val="22"/>
+              </w:rPr>
+            </w:pPr>
+            <w:r>
+              <w:rPr>
+                <w:rFonts w:ascii="Calibri" w:hAnsi="Calibri" w:cs="Calibri"/>
+                <w:sz w:val="22"/>
+                <w:szCs w:val="22"/>
+              </w:rPr>
+              <w:t>completed</w:t>
+            </w:r>
+          </w:p>
+        </w:tc>
+        <w:tc>
+          <w:tcPr>
+            <w:tcW w:w="2765" w:type="dxa"/>
+          </w:tcPr>
+          <w:p>
+            <w:pPr>
+              <w:bidi w:val="0"/>
+              <w:rPr>
+                <w:rFonts w:ascii="Calibri" w:hAnsi="Calibri" w:cs="Calibri"/>
+                <w:sz w:val="22"/>
+                <w:szCs w:val="22"/>
+              </w:rPr>
+            </w:pPr>
+            <w:r>
+              <w:rPr>
+                <w:rFonts w:ascii="Calibri" w:hAnsi="Calibri" w:cs="Calibri"/>
+              </w:rPr>
+              <w:t>Everyone</w:t>
+            </w:r>
+          </w:p>
+        </w:tc>
+        <w:tc>
+          <w:tcPr>
+            <w:tcW w:w="2766" w:type="dxa"/>
+          </w:tcPr>
+          <w:p>
+            <w:pPr>
+              <w:bidi w:val="0"/>
+              <w:rPr>
+                <w:rFonts w:ascii="Calibri" w:hAnsi="Calibri" w:cs="Calibri"/>
+                <w:sz w:val="22"/>
+                <w:szCs w:val="22"/>
+              </w:rPr>
+            </w:pPr>
+            <w:r>
+              <w:rPr>
+                <w:rFonts w:ascii="Calibri" w:hAnsi="Calibri" w:cs="Calibri"/>
+                <w:sz w:val="22"/>
+                <w:szCs w:val="22"/>
+              </w:rPr>
+              <w:t xml:space="preserve">Creating </w:t>
+            </w:r>
+            <w:r>
+              <w:rPr>
+                <w:rFonts w:ascii="Calibri" w:hAnsi="Calibri" w:cs="Calibri"/>
+                <w:sz w:val="22"/>
+                <w:szCs w:val="22"/>
+              </w:rPr>
+              <w:t>acceptance tests</w:t>
+            </w:r>
+          </w:p>
+        </w:tc>
+      </w:tr>
+    </w:tbl>
+    <w:p>
+      <w:pPr>
+        <w:bidi w:val="0"/>
+        <w:rPr>
+          <w:rFonts w:ascii="Calibri" w:hAnsi="Calibri" w:cs="Calibri"/>
+          <w:sz w:val="22"/>
+          <w:szCs w:val="22"/>
+          <w:rtl/>
+        </w:rPr>
+      </w:pPr>
+    </w:p>
+    <w:p>
+      <w:pPr>
+        <w:bidi w:val="0"/>
+        <w:rPr>
+          <w:rFonts w:ascii="Calibri" w:hAnsi="Calibri" w:cs="Calibri"/>
+          <w:sz w:val="22"/>
+          <w:szCs w:val="22"/>
+        </w:rPr>
+      </w:pPr>
+      <w:r>
+        <w:rPr>
+          <w:rFonts w:ascii="Calibri" w:hAnsi="Calibri" w:cs="Calibri"/>
+          <w:sz w:val="22"/>
+          <w:szCs w:val="22"/>
+          <w:u w:val="single"/>
+        </w:rPr>
+        <w:t>Week 3:</w:t>
+      </w:r>
+    </w:p>
+    <w:tbl>
+      <w:tblPr>
+        <w:tblStyle w:val="af2"/>
+        <w:bidiVisual/>
+        <w:tblW w:w="0" w:type="auto"/>
+        <w:tblLook w:val="04A0" w:firstRow="1" w:lastRow="0" w:firstColumn="1" w:lastColumn="0" w:noHBand="0" w:noVBand="1"/>
+      </w:tblPr>
+      <w:tblGrid>
+        <w:gridCol w:w="2765"/>
+        <w:gridCol w:w="2765"/>
+        <w:gridCol w:w="2766"/>
+      </w:tblGrid>
+      <w:tr>
+        <w:tc>
+          <w:tcPr>
+            <w:tcW w:w="2765" w:type="dxa"/>
+          </w:tcPr>
+          <w:p>
+            <w:pPr>
+              <w:bidi w:val="0"/>
+              <w:rPr>
+                <w:rFonts w:ascii="Calibri" w:hAnsi="Calibri" w:cs="Calibri"/>
+                <w:b/>
+                <w:bCs/>
+                <w:sz w:val="22"/>
+                <w:szCs w:val="22"/>
+                <w:rtl/>
+              </w:rPr>
+            </w:pPr>
+            <w:r>
+              <w:rPr>
+                <w:rFonts w:ascii="Calibri" w:hAnsi="Calibri" w:cs="Calibri"/>
+                <w:b/>
+                <w:bCs/>
+                <w:sz w:val="22"/>
+                <w:szCs w:val="22"/>
+              </w:rPr>
+              <w:t>Estimated</w:t>
+            </w:r>
+            <w:r>
+              <w:rPr>
+                <w:rFonts w:ascii="Calibri" w:hAnsi="Calibri" w:cs="Calibri"/>
+                <w:b/>
+                <w:bCs/>
+                <w:sz w:val="22"/>
+                <w:szCs w:val="22"/>
+              </w:rPr>
+              <w:t xml:space="preserve"> </w:t>
+            </w:r>
+            <w:r>
+              <w:rPr>
+                <w:rFonts w:ascii="Calibri" w:hAnsi="Calibri" w:cs="Calibri"/>
+                <w:b/>
+                <w:bCs/>
+                <w:sz w:val="22"/>
+                <w:szCs w:val="22"/>
+              </w:rPr>
+              <w:t>Time</w:t>
+            </w:r>
+          </w:p>
+        </w:tc>
+        <w:tc>
+          <w:tcPr>
+            <w:tcW w:w="2765" w:type="dxa"/>
+          </w:tcPr>
+          <w:p>
+            <w:pPr>
+              <w:bidi w:val="0"/>
+              <w:rPr>
+                <w:rFonts w:ascii="Calibri" w:hAnsi="Calibri" w:cs="Calibri"/>
+                <w:b/>
+                <w:bCs/>
+                <w:sz w:val="22"/>
+                <w:szCs w:val="22"/>
+                <w:rtl/>
+              </w:rPr>
+            </w:pPr>
+            <w:r>
+              <w:rPr>
+                <w:rFonts w:ascii="Calibri" w:hAnsi="Calibri" w:cs="Calibri"/>
+                <w:b/>
+                <w:bCs/>
+                <w:sz w:val="22"/>
+                <w:szCs w:val="22"/>
+              </w:rPr>
+              <w:t>Assigned To</w:t>
+            </w:r>
+          </w:p>
+        </w:tc>
+        <w:tc>
+          <w:tcPr>
+            <w:tcW w:w="2766" w:type="dxa"/>
+          </w:tcPr>
+          <w:p>
+            <w:pPr>
+              <w:bidi w:val="0"/>
+              <w:rPr>
+                <w:rFonts w:ascii="Calibri" w:hAnsi="Calibri" w:cs="Calibri"/>
+                <w:b/>
+                <w:bCs/>
+                <w:sz w:val="22"/>
+                <w:szCs w:val="22"/>
+                <w:rtl/>
+              </w:rPr>
+            </w:pPr>
+            <w:r>
+              <w:rPr>
+                <w:rFonts w:ascii="Calibri" w:hAnsi="Calibri" w:cs="Calibri"/>
+                <w:b/>
+                <w:bCs/>
+                <w:sz w:val="22"/>
+                <w:szCs w:val="22"/>
+              </w:rPr>
+              <w:t>Task</w:t>
+            </w:r>
+          </w:p>
+        </w:tc>
+      </w:tr>
+      <w:tr>
+        <w:tc>
+          <w:tcPr>
+            <w:tcW w:w="2765" w:type="dxa"/>
+          </w:tcPr>
+          <w:p>
+            <w:pPr>
+              <w:jc w:val="center"/>
+              <w:rPr>
+                <w:rFonts w:ascii="Calibri" w:hAnsi="Calibri" w:cs="Calibri"/>
+                <w:sz w:val="22"/>
+                <w:szCs w:val="22"/>
+                <w:rtl/>
+              </w:rPr>
+            </w:pPr>
+            <w:r>
+              <w:rPr>
+                <w:rFonts w:ascii="Calibri" w:hAnsi="Calibri" w:cs="Calibri"/>
+                <w:sz w:val="22"/>
+                <w:szCs w:val="22"/>
+              </w:rPr>
+              <w:t>5</w:t>
+            </w:r>
+            <w:r>
+              <w:rPr>
+                <w:rFonts w:ascii="Calibri" w:hAnsi="Calibri" w:cs="Calibri"/>
+                <w:sz w:val="22"/>
+                <w:szCs w:val="22"/>
+              </w:rPr>
+              <w:t>h</w:t>
+            </w:r>
+          </w:p>
+        </w:tc>
+        <w:tc>
+          <w:tcPr>
+            <w:tcW w:w="2765" w:type="dxa"/>
+          </w:tcPr>
+          <w:p>
+            <w:pPr>
+              <w:pStyle w:val="p1"/>
+              <w:rPr>
+                <w:rFonts w:ascii="Calibri" w:hAnsi="Calibri" w:cs="Calibri"/>
+                <w:lang w:val="en-US"/>
+              </w:rPr>
+            </w:pPr>
+            <w:r>
+              <w:rPr>
+                <w:rFonts w:ascii="Calibri" w:hAnsi="Calibri" w:cs="Calibri"/>
+                <w:lang w:val="en-US"/>
+              </w:rPr>
+              <w:t>Lior</w:t>
+            </w:r>
+            <w:r>
+              <w:rPr>
+                <w:rFonts w:ascii="Calibri" w:hAnsi="Calibri" w:cs="Calibri"/>
+                <w:lang w:val="en-US"/>
+              </w:rPr>
+              <w:t>, Dor</w:t>
+            </w:r>
+          </w:p>
+        </w:tc>
+        <w:tc>
+          <w:tcPr>
+            <w:tcW w:w="2766" w:type="dxa"/>
+          </w:tcPr>
+          <w:p>
+            <w:pPr>
+              <w:bidi w:val="0"/>
+              <w:rPr>
+                <w:rFonts w:ascii="Calibri" w:hAnsi="Calibri" w:cs="Calibri"/>
+                <w:sz w:val="22"/>
+                <w:szCs w:val="22"/>
+              </w:rPr>
+            </w:pPr>
+            <w:r>
+              <w:rPr>
+                <w:rFonts w:ascii="Calibri" w:hAnsi="Calibri" w:cs="Calibri"/>
+                <w:sz w:val="22"/>
+                <w:szCs w:val="22"/>
+              </w:rPr>
+              <w:t xml:space="preserve">Creating class diagram </w:t>
+            </w:r>
+          </w:p>
+        </w:tc>
+      </w:tr>
+      <w:tr>
+        <w:tc>
+          <w:tcPr>
+            <w:tcW w:w="2765" w:type="dxa"/>
+          </w:tcPr>
+          <w:p>
+            <w:pPr>
+              <w:jc w:val="center"/>
+              <w:rPr>
+                <w:rFonts w:ascii="Calibri" w:hAnsi="Calibri" w:cs="Calibri"/>
+                <w:sz w:val="22"/>
+                <w:szCs w:val="22"/>
+                <w:rtl/>
+              </w:rPr>
+            </w:pPr>
+            <w:r>
+              <w:rPr>
+                <w:rFonts w:ascii="Calibri" w:hAnsi="Calibri" w:cs="Calibri"/>
+                <w:sz w:val="22"/>
+                <w:szCs w:val="22"/>
+              </w:rPr>
+              <w:t>3h</w:t>
+            </w:r>
+          </w:p>
+        </w:tc>
+        <w:tc>
+          <w:tcPr>
+            <w:tcW w:w="2765" w:type="dxa"/>
+          </w:tcPr>
+          <w:p>
+            <w:pPr>
+              <w:bidi w:val="0"/>
+              <w:rPr>
+                <w:rFonts w:ascii="Calibri" w:hAnsi="Calibri" w:cs="Calibri"/>
+                <w:sz w:val="22"/>
+                <w:szCs w:val="22"/>
+              </w:rPr>
+            </w:pPr>
+            <w:r>
+              <w:rPr>
+                <w:rFonts w:ascii="Calibri" w:hAnsi="Calibri" w:cs="Calibri"/>
+                <w:sz w:val="22"/>
+                <w:szCs w:val="22"/>
+              </w:rPr>
+              <w:t xml:space="preserve">Adi, </w:t>
+            </w:r>
+            <w:r>
+              <w:rPr>
+                <w:rFonts w:ascii="Calibri" w:hAnsi="Calibri" w:cs="Calibri"/>
+                <w:sz w:val="22"/>
+                <w:szCs w:val="22"/>
+              </w:rPr>
+              <w:t>Anna</w:t>
+            </w:r>
+          </w:p>
+        </w:tc>
+        <w:tc>
+          <w:tcPr>
+            <w:tcW w:w="2766" w:type="dxa"/>
+          </w:tcPr>
+          <w:p>
+            <w:pPr>
+              <w:pStyle w:val="p1"/>
+              <w:rPr>
+                <w:rFonts w:ascii="Calibri" w:hAnsi="Calibri" w:cs="Calibri"/>
+              </w:rPr>
+            </w:pPr>
+            <w:r>
+              <w:rPr>
+                <w:rFonts w:ascii="Calibri" w:hAnsi="Calibri" w:cs="Calibri"/>
+                <w:sz w:val="22"/>
+                <w:szCs w:val="22"/>
+              </w:rPr>
+              <w:t xml:space="preserve">Activity diagram for </w:t>
+            </w:r>
+            <w:r>
+              <w:rPr>
+                <w:rFonts w:ascii="Calibri" w:hAnsi="Calibri" w:cs="Calibri"/>
+                <w:sz w:val="22"/>
+                <w:szCs w:val="22"/>
+                <w:lang w:val="en-US"/>
+              </w:rPr>
+              <w:t>booking of visit</w:t>
+            </w:r>
+            <w:r>
+              <w:rPr>
+                <w:rFonts w:ascii="Calibri" w:hAnsi="Calibri" w:cs="Calibri"/>
+                <w:sz w:val="22"/>
+                <w:szCs w:val="22"/>
+              </w:rPr>
+              <w:t xml:space="preserve"> </w:t>
+            </w:r>
+          </w:p>
+        </w:tc>
+      </w:tr>
+      <w:tr>
+        <w:tc>
+          <w:tcPr>
+            <w:tcW w:w="2765" w:type="dxa"/>
+          </w:tcPr>
+          <w:p>
+            <w:pPr>
+              <w:jc w:val="center"/>
+              <w:rPr>
+                <w:rFonts w:ascii="Calibri" w:hAnsi="Calibri" w:cs="Calibri"/>
+                <w:sz w:val="22"/>
+                <w:szCs w:val="22"/>
+              </w:rPr>
+            </w:pPr>
+            <w:r>
+              <w:rPr>
+                <w:rFonts w:ascii="Calibri" w:hAnsi="Calibri" w:cs="Calibri"/>
+                <w:sz w:val="22"/>
+                <w:szCs w:val="22"/>
+              </w:rPr>
+              <w:t>3h</w:t>
+            </w:r>
+          </w:p>
+        </w:tc>
+        <w:tc>
+          <w:tcPr>
+            <w:tcW w:w="2765" w:type="dxa"/>
+          </w:tcPr>
+          <w:p>
+            <w:pPr>
+              <w:bidi w:val="0"/>
+              <w:rPr>
+                <w:rFonts w:ascii="Calibri" w:hAnsi="Calibri" w:cs="Calibri"/>
+                <w:sz w:val="22"/>
+                <w:szCs w:val="22"/>
+              </w:rPr>
+            </w:pPr>
+            <w:r>
+              <w:rPr>
+                <w:rFonts w:ascii="Calibri" w:hAnsi="Calibri" w:cs="Calibri"/>
+                <w:sz w:val="22"/>
+                <w:szCs w:val="22"/>
+              </w:rPr>
+              <w:t>Li</w:t>
+            </w:r>
+            <w:r>
+              <w:rPr>
+                <w:rFonts w:ascii="Calibri" w:hAnsi="Calibri" w:cs="Calibri"/>
+                <w:sz w:val="22"/>
+                <w:szCs w:val="22"/>
+              </w:rPr>
+              <w:t>or</w:t>
+            </w:r>
+            <w:r>
+              <w:rPr>
+                <w:rFonts w:ascii="Calibri" w:hAnsi="Calibri" w:cs="Calibri"/>
+                <w:sz w:val="22"/>
+                <w:szCs w:val="22"/>
+              </w:rPr>
+              <w:t>, Anna</w:t>
+            </w:r>
+          </w:p>
+        </w:tc>
+        <w:tc>
+          <w:tcPr>
+            <w:tcW w:w="2766" w:type="dxa"/>
+          </w:tcPr>
+          <w:p>
+            <w:pPr>
+              <w:bidi w:val="0"/>
+              <w:rPr>
+                <w:rFonts w:ascii="Calibri" w:hAnsi="Calibri" w:cs="Calibri"/>
+                <w:sz w:val="22"/>
+                <w:szCs w:val="22"/>
+              </w:rPr>
+            </w:pPr>
+            <w:r>
+              <w:rPr>
+                <w:rFonts w:ascii="Calibri" w:hAnsi="Calibri" w:cs="Calibri"/>
+                <w:sz w:val="22"/>
+                <w:szCs w:val="22"/>
+              </w:rPr>
+              <w:t>Activity diagram for watching reports</w:t>
+            </w:r>
+          </w:p>
+        </w:tc>
+      </w:tr>
+    </w:tbl>
+    <w:p>
+      <w:pPr>
+        <w:bidi w:val="0"/>
+        <w:rPr>
+          <w:rFonts w:ascii="Calibri" w:hAnsi="Calibri" w:cs="Calibri"/>
+          <w:sz w:val="22"/>
+          <w:szCs w:val="22"/>
+          <w:u w:val="single"/>
+        </w:rPr>
+      </w:pPr>
+    </w:p>
+    <w:p>
+      <w:pPr>
+        <w:bidi w:val="0"/>
+        <w:rPr>
+          <w:rFonts w:ascii="Calibri" w:hAnsi="Calibri" w:cs="Calibri"/>
+          <w:sz w:val="22"/>
+          <w:szCs w:val="22"/>
+          <w:u w:val="single"/>
+        </w:rPr>
+      </w:pPr>
+    </w:p>
+    <w:p>
+      <w:pPr>
+        <w:bidi w:val="0"/>
+        <w:rPr>
+          <w:rFonts w:ascii="Calibri" w:hAnsi="Calibri" w:cs="Calibri"/>
+          <w:sz w:val="22"/>
+          <w:szCs w:val="22"/>
+          <w:u w:val="single"/>
+        </w:rPr>
+      </w:pPr>
+    </w:p>
+    <w:p>
+      <w:pPr>
+        <w:bidi w:val="0"/>
+        <w:rPr>
+          <w:rFonts w:ascii="Calibri" w:hAnsi="Calibri" w:cs="Calibri"/>
+          <w:sz w:val="22"/>
+          <w:szCs w:val="22"/>
+          <w:u w:val="single"/>
+        </w:rPr>
+      </w:pPr>
+      <w:r>
+        <w:rPr>
+          <w:rFonts w:ascii="Calibri" w:hAnsi="Calibri" w:cs="Calibri"/>
+          <w:sz w:val="22"/>
+          <w:szCs w:val="22"/>
+          <w:u w:val="single"/>
+        </w:rPr>
+        <w:lastRenderedPageBreak/>
+        <w:t>Week 4:</w:t>
+      </w:r>
+    </w:p>
+    <w:tbl>
+      <w:tblPr>
+        <w:tblStyle w:val="af2"/>
+        <w:bidiVisual/>
+        <w:tblW w:w="0" w:type="auto"/>
+        <w:tblLook w:val="04A0" w:firstRow="1" w:lastRow="0" w:firstColumn="1" w:lastColumn="0" w:noHBand="0" w:noVBand="1"/>
+      </w:tblPr>
+      <w:tblGrid>
+        <w:gridCol w:w="2765"/>
+        <w:gridCol w:w="2765"/>
+        <w:gridCol w:w="2766"/>
+      </w:tblGrid>
+      <w:tr>
+        <w:tc>
+          <w:tcPr>
+            <w:tcW w:w="2765" w:type="dxa"/>
+          </w:tcPr>
+          <w:p>
+            <w:pPr>
+              <w:bidi w:val="0"/>
+              <w:rPr>
+                <w:rFonts w:ascii="Calibri" w:hAnsi="Calibri" w:cs="Calibri"/>
+                <w:b/>
+                <w:bCs/>
+                <w:sz w:val="22"/>
+                <w:szCs w:val="22"/>
+                <w:rtl/>
+              </w:rPr>
+            </w:pPr>
+            <w:r>
+              <w:rPr>
+                <w:rFonts w:ascii="Calibri" w:hAnsi="Calibri" w:cs="Calibri"/>
+                <w:b/>
+                <w:bCs/>
+                <w:sz w:val="22"/>
+                <w:szCs w:val="22"/>
+              </w:rPr>
+              <w:t>Estimated Time</w:t>
+            </w:r>
+          </w:p>
+        </w:tc>
+        <w:tc>
+          <w:tcPr>
+            <w:tcW w:w="2765" w:type="dxa"/>
+          </w:tcPr>
+          <w:p>
+            <w:pPr>
+              <w:bidi w:val="0"/>
+              <w:rPr>
+                <w:rFonts w:ascii="Calibri" w:hAnsi="Calibri" w:cs="Calibri"/>
+                <w:b/>
+                <w:bCs/>
+                <w:sz w:val="22"/>
+                <w:szCs w:val="22"/>
+                <w:rtl/>
+              </w:rPr>
+            </w:pPr>
+            <w:r>
+              <w:rPr>
+                <w:rFonts w:ascii="Calibri" w:hAnsi="Calibri" w:cs="Calibri"/>
+                <w:b/>
+                <w:bCs/>
+                <w:sz w:val="22"/>
+                <w:szCs w:val="22"/>
+              </w:rPr>
+              <w:t>Assigned To</w:t>
+            </w:r>
+          </w:p>
+        </w:tc>
+        <w:tc>
+          <w:tcPr>
+            <w:tcW w:w="2766" w:type="dxa"/>
+          </w:tcPr>
+          <w:p>
+            <w:pPr>
+              <w:bidi w:val="0"/>
+              <w:rPr>
+                <w:rFonts w:ascii="Calibri" w:hAnsi="Calibri" w:cs="Calibri"/>
+                <w:b/>
+                <w:bCs/>
+                <w:sz w:val="22"/>
+                <w:szCs w:val="22"/>
+                <w:rtl/>
+              </w:rPr>
+            </w:pPr>
+            <w:r>
+              <w:rPr>
+                <w:rFonts w:ascii="Calibri" w:hAnsi="Calibri" w:cs="Calibri"/>
+                <w:b/>
+                <w:bCs/>
+                <w:sz w:val="22"/>
+                <w:szCs w:val="22"/>
+              </w:rPr>
+              <w:t>Task</w:t>
+            </w:r>
+          </w:p>
+        </w:tc>
+      </w:tr>
+      <w:tr>
+        <w:tc>
+          <w:tcPr>
+            <w:tcW w:w="2765" w:type="dxa"/>
+          </w:tcPr>
+          <w:p>
+            <w:pPr>
+              <w:tabs>
+                <w:tab w:val="left" w:pos="813"/>
+              </w:tabs>
+              <w:bidi w:val="0"/>
+              <w:jc w:val="center"/>
+              <w:rPr>
+                <w:rFonts w:ascii="Calibri" w:hAnsi="Calibri" w:cs="Calibri"/>
+                <w:sz w:val="22"/>
+                <w:szCs w:val="22"/>
+              </w:rPr>
+            </w:pPr>
+            <w:r>
+              <w:rPr>
+                <w:rFonts w:ascii="Calibri" w:hAnsi="Calibri" w:cs="Calibri"/>
+                <w:sz w:val="22"/>
+                <w:szCs w:val="22"/>
+              </w:rPr>
+              <w:t>1h</w:t>
+            </w:r>
+          </w:p>
+        </w:tc>
+        <w:tc>
+          <w:tcPr>
+            <w:tcW w:w="2765" w:type="dxa"/>
+          </w:tcPr>
+          <w:p>
+            <w:pPr>
+              <w:pStyle w:val="p1"/>
+              <w:rPr>
+                <w:rFonts w:ascii="Calibri" w:hAnsi="Calibri" w:cs="Calibri"/>
+                <w:lang w:val="en-US"/>
+              </w:rPr>
+            </w:pPr>
+            <w:r>
+              <w:rPr>
+                <w:rFonts w:ascii="Calibri" w:hAnsi="Calibri" w:cs="Calibri"/>
+                <w:lang w:val="en-US"/>
+              </w:rPr>
+              <w:t>Everyone</w:t>
+            </w:r>
+          </w:p>
+        </w:tc>
+        <w:tc>
+          <w:tcPr>
+            <w:tcW w:w="2766" w:type="dxa"/>
+          </w:tcPr>
+          <w:p>
+            <w:pPr>
+              <w:bidi w:val="0"/>
+              <w:rPr>
+                <w:rFonts w:ascii="Calibri" w:hAnsi="Calibri" w:cs="Calibri"/>
+                <w:sz w:val="22"/>
+                <w:szCs w:val="22"/>
+              </w:rPr>
+            </w:pPr>
+            <w:r>
+              <w:rPr>
+                <w:rFonts w:ascii="Calibri" w:hAnsi="Calibri" w:cs="Calibri"/>
+                <w:sz w:val="22"/>
+                <w:szCs w:val="22"/>
+              </w:rPr>
+              <w:t>Scrum meeting - Show progress with diagrams</w:t>
+            </w:r>
+          </w:p>
+        </w:tc>
+      </w:tr>
+      <w:tr>
+        <w:tc>
+          <w:tcPr>
+            <w:tcW w:w="2765" w:type="dxa"/>
+          </w:tcPr>
+          <w:p>
+            <w:pPr>
+              <w:tabs>
+                <w:tab w:val="left" w:pos="813"/>
+              </w:tabs>
+              <w:bidi w:val="0"/>
+              <w:jc w:val="center"/>
+              <w:rPr>
+                <w:rFonts w:ascii="Calibri" w:hAnsi="Calibri" w:cs="Calibri"/>
+                <w:sz w:val="22"/>
+                <w:szCs w:val="22"/>
+                <w:rtl/>
+              </w:rPr>
+            </w:pPr>
+            <w:r>
+              <w:rPr>
+                <w:rFonts w:ascii="Calibri" w:hAnsi="Calibri" w:cs="Calibri"/>
+                <w:sz w:val="22"/>
+                <w:szCs w:val="22"/>
+              </w:rPr>
+              <w:t>5</w:t>
+            </w:r>
+            <w:r>
+              <w:rPr>
+                <w:rFonts w:ascii="Calibri" w:hAnsi="Calibri" w:cs="Calibri"/>
+                <w:sz w:val="22"/>
+                <w:szCs w:val="22"/>
+              </w:rPr>
+              <w:t>h</w:t>
+            </w:r>
+          </w:p>
+        </w:tc>
+        <w:tc>
+          <w:tcPr>
+            <w:tcW w:w="2765" w:type="dxa"/>
+          </w:tcPr>
+          <w:p>
+            <w:pPr>
+              <w:pStyle w:val="p1"/>
+              <w:rPr>
+                <w:rFonts w:ascii="Calibri" w:hAnsi="Calibri" w:cs="Calibri"/>
+                <w:lang w:val="en-US"/>
+              </w:rPr>
+            </w:pPr>
+            <w:r>
+              <w:rPr>
+                <w:rFonts w:ascii="Calibri" w:hAnsi="Calibri" w:cs="Calibri"/>
+                <w:lang w:val="en-US"/>
+              </w:rPr>
+              <w:t>Anna, Dor</w:t>
+            </w:r>
+          </w:p>
+        </w:tc>
+        <w:tc>
+          <w:tcPr>
+            <w:tcW w:w="2766" w:type="dxa"/>
+          </w:tcPr>
+          <w:p>
+            <w:pPr>
+              <w:bidi w:val="0"/>
+              <w:rPr>
+                <w:rFonts w:ascii="Calibri" w:hAnsi="Calibri" w:cs="Calibri"/>
+                <w:sz w:val="22"/>
+                <w:szCs w:val="22"/>
+              </w:rPr>
+            </w:pPr>
+            <w:r>
+              <w:rPr>
+                <w:rFonts w:ascii="Calibri" w:hAnsi="Calibri" w:cs="Calibri"/>
+                <w:sz w:val="22"/>
+                <w:szCs w:val="22"/>
+              </w:rPr>
+              <w:t xml:space="preserve">Sequence diagram for </w:t>
+            </w:r>
+            <w:r>
+              <w:rPr>
+                <w:rFonts w:ascii="Calibri" w:hAnsi="Calibri" w:cs="Calibri"/>
+                <w:sz w:val="22"/>
+                <w:szCs w:val="22"/>
+              </w:rPr>
+              <w:t>booking of visit</w:t>
+            </w:r>
+          </w:p>
+        </w:tc>
+      </w:tr>
+      <w:tr>
+        <w:tc>
+          <w:tcPr>
+            <w:tcW w:w="2765" w:type="dxa"/>
+          </w:tcPr>
+          <w:p>
+            <w:pPr>
+              <w:bidi w:val="0"/>
+              <w:jc w:val="center"/>
+              <w:rPr>
+                <w:rFonts w:ascii="Calibri" w:hAnsi="Calibri" w:cs="Calibri"/>
+                <w:sz w:val="22"/>
+                <w:szCs w:val="22"/>
+                <w:rtl/>
+              </w:rPr>
+            </w:pPr>
+            <w:r>
+              <w:rPr>
+                <w:rFonts w:ascii="Calibri" w:hAnsi="Calibri" w:cs="Calibri"/>
+                <w:sz w:val="22"/>
+                <w:szCs w:val="22"/>
+              </w:rPr>
+              <w:t>2h</w:t>
+            </w:r>
+          </w:p>
+        </w:tc>
+        <w:tc>
+          <w:tcPr>
+            <w:tcW w:w="2765" w:type="dxa"/>
+          </w:tcPr>
+          <w:p>
+            <w:pPr>
+              <w:bidi w:val="0"/>
+              <w:rPr>
+                <w:rFonts w:ascii="Calibri" w:hAnsi="Calibri" w:cs="Calibri"/>
+                <w:sz w:val="22"/>
+                <w:szCs w:val="22"/>
+              </w:rPr>
+            </w:pPr>
+            <w:r>
+              <w:rPr>
+                <w:rFonts w:ascii="Calibri" w:hAnsi="Calibri" w:cs="Calibri"/>
+              </w:rPr>
+              <w:t>Anna, Lior, Adi</w:t>
+            </w:r>
+          </w:p>
+        </w:tc>
+        <w:tc>
+          <w:tcPr>
+            <w:tcW w:w="2766" w:type="dxa"/>
+          </w:tcPr>
+          <w:p>
+            <w:pPr>
+              <w:pStyle w:val="p1"/>
+              <w:rPr>
+                <w:rFonts w:ascii="Calibri" w:hAnsi="Calibri" w:cs="Calibri"/>
+                <w:rtl/>
+              </w:rPr>
+            </w:pPr>
+            <w:r>
+              <w:rPr>
+                <w:rFonts w:ascii="Calibri" w:hAnsi="Calibri" w:cs="Calibri"/>
+                <w:sz w:val="22"/>
+                <w:szCs w:val="22"/>
+              </w:rPr>
+              <w:t>Sequence diagram for watching reports</w:t>
+            </w:r>
+            <w:r>
+              <w:rPr>
+                <w:rFonts w:ascii="Calibri" w:hAnsi="Calibri" w:cs="Calibri"/>
+                <w:sz w:val="21"/>
+                <w:szCs w:val="21"/>
+              </w:rPr>
+              <w:t>.</w:t>
+            </w:r>
+          </w:p>
+        </w:tc>
+      </w:tr>
+      <w:tr>
+        <w:tc>
+          <w:tcPr>
+            <w:tcW w:w="2765" w:type="dxa"/>
+          </w:tcPr>
+          <w:p>
+            <w:pPr>
+              <w:bidi w:val="0"/>
+              <w:jc w:val="center"/>
+              <w:rPr>
+                <w:rFonts w:ascii="Calibri" w:hAnsi="Calibri" w:cs="Calibri"/>
+                <w:sz w:val="22"/>
+                <w:szCs w:val="22"/>
+                <w:rtl/>
+              </w:rPr>
+            </w:pPr>
+            <w:r>
+              <w:rPr>
+                <w:rFonts w:ascii="Calibri" w:hAnsi="Calibri" w:cs="Calibri"/>
+                <w:sz w:val="22"/>
+                <w:szCs w:val="22"/>
+              </w:rPr>
+              <w:t>2</w:t>
+            </w:r>
+            <w:r>
+              <w:rPr>
+                <w:rFonts w:ascii="Calibri" w:hAnsi="Calibri" w:cs="Calibri"/>
+                <w:sz w:val="22"/>
+                <w:szCs w:val="22"/>
+              </w:rPr>
+              <w:t>h</w:t>
+            </w:r>
+          </w:p>
+        </w:tc>
+        <w:tc>
+          <w:tcPr>
+            <w:tcW w:w="2765" w:type="dxa"/>
+          </w:tcPr>
+          <w:p>
+            <w:pPr>
+              <w:pStyle w:val="p1"/>
+              <w:rPr>
+                <w:rFonts w:ascii="Calibri" w:hAnsi="Calibri" w:cs="Calibri"/>
+                <w:lang w:val="en-US"/>
+              </w:rPr>
+            </w:pPr>
+            <w:r>
+              <w:rPr>
+                <w:rFonts w:ascii="Calibri" w:hAnsi="Calibri" w:cs="Calibri"/>
+                <w:lang w:val="en-US"/>
+              </w:rPr>
+              <w:t>Lior</w:t>
+            </w:r>
+          </w:p>
+        </w:tc>
+        <w:tc>
+          <w:tcPr>
+            <w:tcW w:w="2766" w:type="dxa"/>
+          </w:tcPr>
+          <w:p>
+            <w:pPr>
+              <w:bidi w:val="0"/>
+              <w:rPr>
+                <w:rFonts w:ascii="Calibri" w:hAnsi="Calibri" w:cs="Calibri"/>
+                <w:sz w:val="22"/>
+                <w:szCs w:val="22"/>
+              </w:rPr>
+            </w:pPr>
+            <w:r>
+              <w:rPr>
+                <w:rFonts w:ascii="Calibri" w:hAnsi="Calibri" w:cs="Calibri"/>
+                <w:sz w:val="22"/>
+                <w:szCs w:val="22"/>
+              </w:rPr>
+              <w:t>Creating package diagram</w:t>
+            </w:r>
+          </w:p>
+        </w:tc>
+      </w:tr>
+      <w:tr>
+        <w:tc>
+          <w:tcPr>
+            <w:tcW w:w="2765" w:type="dxa"/>
+          </w:tcPr>
+          <w:p>
+            <w:pPr>
+              <w:bidi w:val="0"/>
+              <w:jc w:val="center"/>
+              <w:rPr>
+                <w:rFonts w:ascii="Calibri" w:hAnsi="Calibri" w:cs="Calibri"/>
+                <w:sz w:val="22"/>
+                <w:szCs w:val="22"/>
+              </w:rPr>
+            </w:pPr>
+            <w:r>
+              <w:rPr>
+                <w:rFonts w:ascii="Calibri" w:hAnsi="Calibri" w:cs="Calibri"/>
+                <w:sz w:val="22"/>
+                <w:szCs w:val="22"/>
+              </w:rPr>
+              <w:t>1h</w:t>
+            </w:r>
+          </w:p>
+        </w:tc>
+        <w:tc>
+          <w:tcPr>
+            <w:tcW w:w="2765" w:type="dxa"/>
+          </w:tcPr>
+          <w:p>
+            <w:pPr>
+              <w:bidi w:val="0"/>
+              <w:rPr>
+                <w:rFonts w:ascii="Calibri" w:hAnsi="Calibri" w:cs="Calibri"/>
+                <w:sz w:val="22"/>
+                <w:szCs w:val="22"/>
+              </w:rPr>
+            </w:pPr>
+            <w:r>
+              <w:rPr>
+                <w:rFonts w:ascii="Calibri" w:hAnsi="Calibri" w:cs="Calibri"/>
+              </w:rPr>
+              <w:t>Everyone</w:t>
+            </w:r>
+          </w:p>
+        </w:tc>
+        <w:tc>
+          <w:tcPr>
+            <w:tcW w:w="2766" w:type="dxa"/>
+          </w:tcPr>
+          <w:p>
+            <w:pPr>
+              <w:pStyle w:val="p1"/>
+              <w:rPr>
+                <w:rFonts w:ascii="Calibri" w:hAnsi="Calibri" w:cs="Calibri"/>
+              </w:rPr>
+            </w:pPr>
+            <w:r>
+              <w:rPr>
+                <w:rFonts w:ascii="Calibri" w:hAnsi="Calibri" w:cs="Calibri"/>
+                <w:sz w:val="22"/>
+                <w:szCs w:val="22"/>
+              </w:rPr>
+              <w:t xml:space="preserve">End of architecture design - Finalizing decisions </w:t>
+            </w:r>
+          </w:p>
+        </w:tc>
+      </w:tr>
+    </w:tbl>
+    <w:p>
+      <w:pPr>
+        <w:bidi w:val="0"/>
+        <w:rPr>
+          <w:rFonts w:ascii="Calibri" w:hAnsi="Calibri" w:cs="Calibri"/>
+          <w:sz w:val="22"/>
+          <w:szCs w:val="22"/>
+          <w:u w:val="single"/>
+        </w:rPr>
+      </w:pPr>
+    </w:p>
+    <w:p>
+      <w:pPr>
+        <w:bidi w:val="0"/>
+        <w:rPr>
+          <w:rFonts w:ascii="Calibri" w:hAnsi="Calibri" w:cs="Calibri"/>
+          <w:sz w:val="22"/>
+          <w:szCs w:val="22"/>
+          <w:u w:val="single"/>
+          <w:rtl/>
+        </w:rPr>
+      </w:pPr>
+      <w:r>
+        <w:rPr>
+          <w:rFonts w:ascii="Calibri" w:hAnsi="Calibri" w:cs="Calibri"/>
+          <w:sz w:val="22"/>
+          <w:szCs w:val="22"/>
+          <w:u w:val="single"/>
+        </w:rPr>
+        <w:t xml:space="preserve">Week </w:t>
+      </w:r>
+      <w:r>
+        <w:rPr>
+          <w:rFonts w:ascii="Calibri" w:hAnsi="Calibri" w:cs="Calibri"/>
+          <w:sz w:val="22"/>
+          <w:szCs w:val="22"/>
+          <w:u w:val="single"/>
+        </w:rPr>
+        <w:t>5</w:t>
+      </w:r>
+      <w:r>
+        <w:rPr>
+          <w:rFonts w:ascii="Calibri" w:hAnsi="Calibri" w:cs="Calibri"/>
+          <w:sz w:val="22"/>
+          <w:szCs w:val="22"/>
+          <w:u w:val="single"/>
+        </w:rPr>
+        <w:t>:</w:t>
+      </w:r>
+    </w:p>
+    <w:tbl>
+      <w:tblPr>
+        <w:tblStyle w:val="af2"/>
+        <w:bidiVisual/>
+        <w:tblW w:w="0" w:type="auto"/>
+        <w:tblLook w:val="04A0" w:firstRow="1" w:lastRow="0" w:firstColumn="1" w:lastColumn="0" w:noHBand="0" w:noVBand="1"/>
+      </w:tblPr>
+      <w:tblGrid>
+        <w:gridCol w:w="2765"/>
+        <w:gridCol w:w="2765"/>
+        <w:gridCol w:w="2766"/>
+      </w:tblGrid>
+      <w:tr>
+        <w:tc>
+          <w:tcPr>
+            <w:tcW w:w="2765" w:type="dxa"/>
+          </w:tcPr>
+          <w:p>
+            <w:pPr>
+              <w:bidi w:val="0"/>
+              <w:rPr>
+                <w:rFonts w:ascii="Calibri" w:hAnsi="Calibri" w:cs="Calibri"/>
+                <w:b/>
+                <w:bCs/>
+                <w:sz w:val="22"/>
+                <w:szCs w:val="22"/>
+                <w:rtl/>
+              </w:rPr>
+            </w:pPr>
+            <w:r>
+              <w:rPr>
+                <w:rFonts w:ascii="Calibri" w:hAnsi="Calibri" w:cs="Calibri"/>
+                <w:b/>
+                <w:bCs/>
+                <w:sz w:val="22"/>
+                <w:szCs w:val="22"/>
+              </w:rPr>
+              <w:t>Estimated Time</w:t>
+            </w:r>
+          </w:p>
+        </w:tc>
+        <w:tc>
+          <w:tcPr>
+            <w:tcW w:w="2765" w:type="dxa"/>
+          </w:tcPr>
+          <w:p>
+            <w:pPr>
+              <w:bidi w:val="0"/>
+              <w:rPr>
+                <w:rFonts w:ascii="Calibri" w:hAnsi="Calibri" w:cs="Calibri"/>
+                <w:b/>
+                <w:bCs/>
+                <w:sz w:val="22"/>
+                <w:szCs w:val="22"/>
+                <w:rtl/>
+              </w:rPr>
+            </w:pPr>
+            <w:r>
+              <w:rPr>
+                <w:rFonts w:ascii="Calibri" w:hAnsi="Calibri" w:cs="Calibri"/>
+                <w:b/>
+                <w:bCs/>
+                <w:sz w:val="22"/>
+                <w:szCs w:val="22"/>
+              </w:rPr>
+              <w:t>Assigned To</w:t>
+            </w:r>
+          </w:p>
+        </w:tc>
+        <w:tc>
+          <w:tcPr>
+            <w:tcW w:w="2766" w:type="dxa"/>
+          </w:tcPr>
+          <w:p>
+            <w:pPr>
+              <w:bidi w:val="0"/>
+              <w:rPr>
+                <w:rFonts w:ascii="Calibri" w:hAnsi="Calibri" w:cs="Calibri"/>
+                <w:b/>
+                <w:bCs/>
+                <w:sz w:val="22"/>
+                <w:szCs w:val="22"/>
+                <w:rtl/>
+              </w:rPr>
+            </w:pPr>
+            <w:r>
+              <w:rPr>
+                <w:rFonts w:ascii="Calibri" w:hAnsi="Calibri" w:cs="Calibri"/>
+                <w:b/>
+                <w:bCs/>
+                <w:sz w:val="22"/>
+                <w:szCs w:val="22"/>
+              </w:rPr>
+              <w:t>Task</w:t>
+            </w:r>
+          </w:p>
+        </w:tc>
+      </w:tr>
+      <w:tr>
+        <w:tc>
+          <w:tcPr>
+            <w:tcW w:w="2765" w:type="dxa"/>
+          </w:tcPr>
+          <w:p>
+            <w:pPr>
+              <w:bidi w:val="0"/>
+              <w:jc w:val="center"/>
+              <w:rPr>
+                <w:rFonts w:ascii="Calibri" w:hAnsi="Calibri" w:cs="Calibri"/>
+                <w:sz w:val="22"/>
+                <w:szCs w:val="22"/>
+              </w:rPr>
+            </w:pPr>
+            <w:r>
+              <w:rPr>
+                <w:rFonts w:ascii="Calibri" w:hAnsi="Calibri" w:cs="Calibri"/>
+                <w:sz w:val="22"/>
+                <w:szCs w:val="22"/>
+              </w:rPr>
+              <w:t>2</w:t>
+            </w:r>
+            <w:r>
+              <w:rPr>
+                <w:rFonts w:ascii="Calibri" w:hAnsi="Calibri" w:cs="Calibri"/>
+                <w:sz w:val="22"/>
+                <w:szCs w:val="22"/>
+              </w:rPr>
+              <w:t>h</w:t>
+            </w:r>
+          </w:p>
+        </w:tc>
+        <w:tc>
+          <w:tcPr>
+            <w:tcW w:w="2765" w:type="dxa"/>
+          </w:tcPr>
+          <w:p>
+            <w:pPr>
+              <w:bidi w:val="0"/>
+              <w:rPr>
+                <w:rFonts w:ascii="Calibri" w:hAnsi="Calibri" w:cs="Calibri"/>
+                <w:sz w:val="22"/>
+                <w:szCs w:val="22"/>
+              </w:rPr>
+            </w:pPr>
+            <w:r>
+              <w:rPr>
+                <w:rFonts w:ascii="Calibri" w:hAnsi="Calibri" w:cs="Calibri"/>
+              </w:rPr>
+              <w:t>Everyone</w:t>
+            </w:r>
+          </w:p>
+        </w:tc>
+        <w:tc>
+          <w:tcPr>
+            <w:tcW w:w="2766" w:type="dxa"/>
+          </w:tcPr>
+          <w:p>
+            <w:pPr>
+              <w:bidi w:val="0"/>
+              <w:rPr>
+                <w:rFonts w:ascii="Calibri" w:hAnsi="Calibri" w:cs="Calibri"/>
+                <w:sz w:val="22"/>
+                <w:szCs w:val="22"/>
+              </w:rPr>
+            </w:pPr>
+            <w:r>
+              <w:rPr>
+                <w:rFonts w:ascii="Calibri" w:hAnsi="Calibri" w:cs="Calibri"/>
+                <w:sz w:val="22"/>
+                <w:szCs w:val="22"/>
+              </w:rPr>
+              <w:t xml:space="preserve">Scrum meeting - Reviewing </w:t>
+            </w:r>
+            <w:r>
+              <w:rPr>
+                <w:rFonts w:ascii="Calibri" w:hAnsi="Calibri" w:cs="Calibri"/>
+                <w:sz w:val="22"/>
+                <w:szCs w:val="22"/>
+              </w:rPr>
+              <w:t>objectives</w:t>
+            </w:r>
+            <w:r>
+              <w:rPr>
+                <w:rFonts w:ascii="Calibri" w:hAnsi="Calibri" w:cs="Calibri"/>
+                <w:sz w:val="22"/>
+                <w:szCs w:val="22"/>
+              </w:rPr>
+              <w:t xml:space="preserve"> and </w:t>
+            </w:r>
+            <w:r>
+              <w:rPr>
+                <w:rFonts w:ascii="Calibri" w:hAnsi="Calibri" w:cs="Calibri"/>
+                <w:sz w:val="22"/>
+                <w:szCs w:val="22"/>
+              </w:rPr>
+              <w:t>Creating sprint backlog</w:t>
+            </w:r>
+          </w:p>
+        </w:tc>
+      </w:tr>
+      <w:tr>
+        <w:tc>
+          <w:tcPr>
+            <w:tcW w:w="2765" w:type="dxa"/>
+          </w:tcPr>
+          <w:p>
+            <w:pPr>
+              <w:bidi w:val="0"/>
+              <w:jc w:val="center"/>
+              <w:rPr>
+                <w:rFonts w:ascii="Calibri" w:hAnsi="Calibri" w:cs="Calibri"/>
+                <w:sz w:val="22"/>
+                <w:szCs w:val="22"/>
+                <w:rtl/>
+              </w:rPr>
+            </w:pPr>
+            <w:r>
+              <w:rPr>
+                <w:rFonts w:ascii="Calibri" w:hAnsi="Calibri" w:cs="Calibri"/>
+                <w:sz w:val="22"/>
+                <w:szCs w:val="22"/>
+              </w:rPr>
+              <w:t>4h</w:t>
+            </w:r>
+          </w:p>
+        </w:tc>
+        <w:tc>
+          <w:tcPr>
+            <w:tcW w:w="2765" w:type="dxa"/>
+          </w:tcPr>
+          <w:p>
+            <w:pPr>
+              <w:bidi w:val="0"/>
+              <w:rPr>
+                <w:rFonts w:ascii="Calibri" w:hAnsi="Calibri" w:cs="Calibri"/>
+                <w:sz w:val="22"/>
+                <w:szCs w:val="22"/>
+              </w:rPr>
+            </w:pPr>
+            <w:r>
+              <w:rPr>
+                <w:rFonts w:ascii="Calibri" w:hAnsi="Calibri" w:cs="Calibri"/>
+                <w:sz w:val="22"/>
+                <w:szCs w:val="22"/>
+              </w:rPr>
+              <w:t>Adi</w:t>
+            </w:r>
+            <w:r>
+              <w:rPr>
+                <w:rFonts w:ascii="Calibri" w:hAnsi="Calibri" w:cs="Calibri"/>
+                <w:sz w:val="22"/>
+                <w:szCs w:val="22"/>
+              </w:rPr>
+              <w:t>, Lior</w:t>
+            </w:r>
+          </w:p>
+        </w:tc>
+        <w:tc>
+          <w:tcPr>
+            <w:tcW w:w="2766" w:type="dxa"/>
+          </w:tcPr>
+          <w:p>
+            <w:pPr>
+              <w:bidi w:val="0"/>
+              <w:rPr>
+                <w:rFonts w:ascii="Calibri" w:hAnsi="Calibri" w:cs="Calibri"/>
+                <w:sz w:val="22"/>
+                <w:szCs w:val="22"/>
+              </w:rPr>
+            </w:pPr>
+            <w:r>
+              <w:rPr>
+                <w:rFonts w:ascii="Calibri" w:hAnsi="Calibri" w:cs="Calibri"/>
+                <w:sz w:val="22"/>
+                <w:szCs w:val="22"/>
+              </w:rPr>
+              <w:t>Creating Client GUI (update order screen)</w:t>
+            </w:r>
+          </w:p>
+        </w:tc>
+      </w:tr>
+      <w:tr>
+        <w:tc>
+          <w:tcPr>
+            <w:tcW w:w="2765" w:type="dxa"/>
+          </w:tcPr>
+          <w:p>
+            <w:pPr>
+              <w:bidi w:val="0"/>
+              <w:jc w:val="center"/>
+              <w:rPr>
+                <w:rFonts w:ascii="Calibri" w:hAnsi="Calibri" w:cs="Calibri"/>
+                <w:sz w:val="22"/>
+                <w:szCs w:val="22"/>
+              </w:rPr>
+            </w:pPr>
+            <w:r>
+              <w:rPr>
+                <w:rFonts w:ascii="Calibri" w:hAnsi="Calibri" w:cs="Calibri"/>
+                <w:sz w:val="22"/>
+                <w:szCs w:val="22"/>
+              </w:rPr>
+              <w:t>2h</w:t>
+            </w:r>
+          </w:p>
+        </w:tc>
+        <w:tc>
+          <w:tcPr>
+            <w:tcW w:w="2765" w:type="dxa"/>
+          </w:tcPr>
+          <w:p>
+            <w:pPr>
+              <w:bidi w:val="0"/>
+              <w:rPr>
+                <w:rFonts w:ascii="Calibri" w:hAnsi="Calibri" w:cs="Calibri"/>
+                <w:sz w:val="22"/>
+                <w:szCs w:val="22"/>
+                <w:rtl/>
+              </w:rPr>
+            </w:pPr>
+            <w:r>
+              <w:rPr>
+                <w:rFonts w:ascii="Calibri" w:hAnsi="Calibri" w:cs="Calibri"/>
+                <w:sz w:val="22"/>
+                <w:szCs w:val="22"/>
+              </w:rPr>
+              <w:t>Dor</w:t>
+            </w:r>
+          </w:p>
+        </w:tc>
+        <w:tc>
+          <w:tcPr>
+            <w:tcW w:w="2766" w:type="dxa"/>
+          </w:tcPr>
+          <w:p>
+            <w:pPr>
+              <w:bidi w:val="0"/>
+              <w:rPr>
+                <w:rFonts w:ascii="Calibri" w:hAnsi="Calibri" w:cs="Calibri"/>
+                <w:sz w:val="22"/>
+                <w:szCs w:val="22"/>
+              </w:rPr>
+            </w:pPr>
+            <w:r>
+              <w:rPr>
+                <w:rFonts w:ascii="Calibri" w:hAnsi="Calibri" w:cs="Calibri"/>
+                <w:sz w:val="22"/>
+                <w:szCs w:val="22"/>
+              </w:rPr>
+              <w:t>Creating Server GUI</w:t>
+            </w:r>
+          </w:p>
+        </w:tc>
+      </w:tr>
+      <w:tr>
+        <w:tc>
+          <w:tcPr>
+            <w:tcW w:w="2765" w:type="dxa"/>
+          </w:tcPr>
+          <w:p>
+            <w:pPr>
+              <w:bidi w:val="0"/>
+              <w:jc w:val="center"/>
+              <w:rPr>
+                <w:rFonts w:ascii="Calibri" w:hAnsi="Calibri" w:cs="Calibri"/>
+                <w:sz w:val="22"/>
+                <w:szCs w:val="22"/>
+              </w:rPr>
+            </w:pPr>
+            <w:r>
+              <w:rPr>
+                <w:rFonts w:ascii="Calibri" w:hAnsi="Calibri" w:cs="Calibri"/>
+                <w:sz w:val="22"/>
+                <w:szCs w:val="22"/>
+              </w:rPr>
+              <w:t>3h</w:t>
+            </w:r>
+          </w:p>
+        </w:tc>
+        <w:tc>
+          <w:tcPr>
+            <w:tcW w:w="2765" w:type="dxa"/>
+          </w:tcPr>
+          <w:p>
+            <w:pPr>
+              <w:bidi w:val="0"/>
+              <w:rPr>
+                <w:rFonts w:ascii="Calibri" w:hAnsi="Calibri" w:cs="Calibri"/>
+                <w:sz w:val="22"/>
+                <w:szCs w:val="22"/>
+              </w:rPr>
+            </w:pPr>
+            <w:r>
+              <w:rPr>
+                <w:rFonts w:ascii="Calibri" w:hAnsi="Calibri" w:cs="Calibri"/>
+                <w:sz w:val="22"/>
+                <w:szCs w:val="22"/>
+              </w:rPr>
+              <w:t>Adi, Anna</w:t>
+            </w:r>
+          </w:p>
+        </w:tc>
+        <w:tc>
+          <w:tcPr>
+            <w:tcW w:w="2766" w:type="dxa"/>
+          </w:tcPr>
+          <w:p>
+            <w:pPr>
+              <w:bidi w:val="0"/>
+              <w:rPr>
+                <w:rFonts w:ascii="Calibri" w:hAnsi="Calibri" w:cs="Calibri"/>
+                <w:sz w:val="22"/>
+                <w:szCs w:val="22"/>
+              </w:rPr>
+            </w:pPr>
+            <w:r>
+              <w:rPr>
+                <w:rFonts w:ascii="Calibri" w:hAnsi="Calibri" w:cs="Calibri"/>
+                <w:sz w:val="22"/>
+                <w:szCs w:val="22"/>
+              </w:rPr>
+              <w:t>Creating client logic</w:t>
+            </w:r>
+          </w:p>
+        </w:tc>
+      </w:tr>
+      <w:tr>
+        <w:tc>
+          <w:tcPr>
+            <w:tcW w:w="2765" w:type="dxa"/>
+          </w:tcPr>
+          <w:p>
+            <w:pPr>
+              <w:bidi w:val="0"/>
+              <w:jc w:val="center"/>
+              <w:rPr>
+                <w:rFonts w:ascii="Calibri" w:hAnsi="Calibri" w:cs="Calibri"/>
+                <w:sz w:val="22"/>
+                <w:szCs w:val="22"/>
+              </w:rPr>
+            </w:pPr>
+            <w:r>
+              <w:rPr>
+                <w:rFonts w:ascii="Calibri" w:hAnsi="Calibri" w:cs="Calibri"/>
+                <w:sz w:val="22"/>
+                <w:szCs w:val="22"/>
+              </w:rPr>
+              <w:t>3h</w:t>
+            </w:r>
+          </w:p>
+        </w:tc>
+        <w:tc>
+          <w:tcPr>
+            <w:tcW w:w="2765" w:type="dxa"/>
+          </w:tcPr>
+          <w:p>
+            <w:pPr>
+              <w:bidi w:val="0"/>
+              <w:rPr>
+                <w:rFonts w:ascii="Calibri" w:hAnsi="Calibri" w:cs="Calibri"/>
+                <w:sz w:val="22"/>
+                <w:szCs w:val="22"/>
+              </w:rPr>
+            </w:pPr>
+            <w:r>
+              <w:rPr>
+                <w:rFonts w:ascii="Calibri" w:hAnsi="Calibri" w:cs="Calibri"/>
+                <w:sz w:val="22"/>
+                <w:szCs w:val="22"/>
+              </w:rPr>
+              <w:t>Dor</w:t>
+            </w:r>
+          </w:p>
+        </w:tc>
+        <w:tc>
+          <w:tcPr>
+            <w:tcW w:w="2766" w:type="dxa"/>
+          </w:tcPr>
+          <w:p>
+            <w:pPr>
+              <w:bidi w:val="0"/>
+              <w:rPr>
+                <w:rFonts w:ascii="Calibri" w:hAnsi="Calibri" w:cs="Calibri" w:hint="cs"/>
+                <w:sz w:val="22"/>
+                <w:szCs w:val="22"/>
+                <w:rtl/>
+              </w:rPr>
+            </w:pPr>
+            <w:r>
+              <w:rPr>
+                <w:rFonts w:ascii="Calibri" w:hAnsi="Calibri" w:cs="Calibri"/>
+                <w:sz w:val="22"/>
+                <w:szCs w:val="22"/>
+              </w:rPr>
+              <w:t>Creating server logic</w:t>
+            </w:r>
+            <w:r>
+              <w:rPr>
+                <w:rFonts w:ascii="Calibri" w:hAnsi="Calibri" w:cs="Calibri"/>
+                <w:sz w:val="22"/>
+                <w:szCs w:val="22"/>
+              </w:rPr>
+              <w:t xml:space="preserve"> and database</w:t>
+            </w:r>
+          </w:p>
+        </w:tc>
+      </w:tr>
+      <w:tr>
+        <w:tc>
+          <w:tcPr>
+            <w:tcW w:w="2765" w:type="dxa"/>
+          </w:tcPr>
+          <w:p>
+            <w:pPr>
+              <w:bidi w:val="0"/>
+              <w:jc w:val="center"/>
+              <w:rPr>
+                <w:rFonts w:ascii="Calibri" w:hAnsi="Calibri" w:cs="Calibri"/>
+                <w:sz w:val="22"/>
+                <w:szCs w:val="22"/>
+                <w:rtl/>
+              </w:rPr>
+            </w:pPr>
+            <w:r>
+              <w:rPr>
+                <w:rFonts w:ascii="Calibri" w:hAnsi="Calibri" w:cs="Calibri"/>
+                <w:sz w:val="22"/>
+                <w:szCs w:val="22"/>
+              </w:rPr>
+              <w:t>1h</w:t>
+            </w:r>
+          </w:p>
+        </w:tc>
+        <w:tc>
+          <w:tcPr>
+            <w:tcW w:w="2765" w:type="dxa"/>
+          </w:tcPr>
+          <w:p>
+            <w:pPr>
+              <w:bidi w:val="0"/>
+              <w:rPr>
+                <w:rFonts w:ascii="Calibri" w:hAnsi="Calibri" w:cs="Calibri"/>
+                <w:sz w:val="22"/>
+                <w:szCs w:val="22"/>
+                <w:rtl/>
+              </w:rPr>
+            </w:pPr>
+            <w:r>
+              <w:rPr>
+                <w:rFonts w:ascii="Calibri" w:hAnsi="Calibri" w:cs="Calibri"/>
+              </w:rPr>
+              <w:t>Adi</w:t>
+            </w:r>
+          </w:p>
+        </w:tc>
+        <w:tc>
+          <w:tcPr>
+            <w:tcW w:w="2766" w:type="dxa"/>
+          </w:tcPr>
+          <w:p>
+            <w:pPr>
+              <w:pStyle w:val="p1"/>
+              <w:rPr>
+                <w:rFonts w:ascii="Calibri" w:hAnsi="Calibri" w:cs="Calibri"/>
+              </w:rPr>
+            </w:pPr>
+            <w:r>
+              <w:rPr>
+                <w:rFonts w:ascii="Calibri" w:hAnsi="Calibri" w:cs="Calibri"/>
+                <w:sz w:val="22"/>
+                <w:szCs w:val="22"/>
+              </w:rPr>
+              <w:t>Finalizing backend updates</w:t>
+            </w:r>
+          </w:p>
+        </w:tc>
+      </w:tr>
+    </w:tbl>
+    <w:p>
+      <w:pPr>
+        <w:bidi w:val="0"/>
+        <w:rPr>
+          <w:rFonts w:ascii="Calibri" w:hAnsi="Calibri" w:cs="Calibri"/>
+          <w:sz w:val="22"/>
+          <w:szCs w:val="22"/>
+          <w:u w:val="single"/>
+        </w:rPr>
+      </w:pPr>
+    </w:p>
+    <w:p>
+      <w:pPr>
+        <w:bidi w:val="0"/>
+        <w:rPr>
+          <w:rFonts w:ascii="Calibri" w:hAnsi="Calibri" w:cs="Calibri"/>
+          <w:sz w:val="22"/>
+          <w:szCs w:val="22"/>
+          <w:u w:val="single"/>
+        </w:rPr>
+      </w:pPr>
+      <w:r>
+        <w:rPr>
+          <w:rFonts w:ascii="Calibri" w:hAnsi="Calibri" w:cs="Calibri"/>
+          <w:sz w:val="22"/>
+          <w:szCs w:val="22"/>
+          <w:u w:val="single"/>
+        </w:rPr>
+        <w:t>Week 6:</w:t>
+      </w:r>
+    </w:p>
+    <w:tbl>
+      <w:tblPr>
+        <w:tblStyle w:val="af2"/>
+        <w:bidiVisual/>
+        <w:tblW w:w="0" w:type="auto"/>
+        <w:tblLook w:val="04A0" w:firstRow="1" w:lastRow="0" w:firstColumn="1" w:lastColumn="0" w:noHBand="0" w:noVBand="1"/>
+      </w:tblPr>
+      <w:tblGrid>
+        <w:gridCol w:w="2765"/>
+        <w:gridCol w:w="2765"/>
+        <w:gridCol w:w="2766"/>
+      </w:tblGrid>
+      <w:tr>
+        <w:tc>
+          <w:tcPr>
+            <w:tcW w:w="2765" w:type="dxa"/>
+          </w:tcPr>
+          <w:p>
+            <w:pPr>
+              <w:bidi w:val="0"/>
+              <w:rPr>
+                <w:rFonts w:ascii="Calibri" w:hAnsi="Calibri" w:cs="Calibri"/>
+                <w:b/>
+                <w:bCs/>
+                <w:sz w:val="22"/>
+                <w:szCs w:val="22"/>
+                <w:rtl/>
+              </w:rPr>
+            </w:pPr>
+            <w:r>
+              <w:rPr>
+                <w:rFonts w:ascii="Calibri" w:hAnsi="Calibri" w:cs="Calibri"/>
+                <w:b/>
+                <w:bCs/>
+                <w:sz w:val="22"/>
+                <w:szCs w:val="22"/>
+              </w:rPr>
+              <w:t>Estimated Time</w:t>
+            </w:r>
+          </w:p>
+        </w:tc>
+        <w:tc>
+          <w:tcPr>
+            <w:tcW w:w="2765" w:type="dxa"/>
+          </w:tcPr>
+          <w:p>
+            <w:pPr>
+              <w:bidi w:val="0"/>
+              <w:rPr>
+                <w:rFonts w:ascii="Calibri" w:hAnsi="Calibri" w:cs="Calibri"/>
+                <w:b/>
+                <w:bCs/>
+                <w:sz w:val="22"/>
+                <w:szCs w:val="22"/>
+                <w:rtl/>
+              </w:rPr>
+            </w:pPr>
+            <w:r>
+              <w:rPr>
+                <w:rFonts w:ascii="Calibri" w:hAnsi="Calibri" w:cs="Calibri"/>
+                <w:b/>
+                <w:bCs/>
+                <w:sz w:val="22"/>
+                <w:szCs w:val="22"/>
+              </w:rPr>
+              <w:t>Assigned To</w:t>
+            </w:r>
+          </w:p>
+        </w:tc>
+        <w:tc>
+          <w:tcPr>
+            <w:tcW w:w="2766" w:type="dxa"/>
+          </w:tcPr>
+          <w:p>
+            <w:pPr>
+              <w:bidi w:val="0"/>
+              <w:rPr>
+                <w:rFonts w:ascii="Calibri" w:hAnsi="Calibri" w:cs="Calibri"/>
+                <w:b/>
+                <w:bCs/>
+                <w:sz w:val="22"/>
+                <w:szCs w:val="22"/>
+                <w:rtl/>
+              </w:rPr>
+            </w:pPr>
+            <w:r>
+              <w:rPr>
+                <w:rFonts w:ascii="Calibri" w:hAnsi="Calibri" w:cs="Calibri"/>
+                <w:b/>
+                <w:bCs/>
+                <w:sz w:val="22"/>
+                <w:szCs w:val="22"/>
+              </w:rPr>
+              <w:t>Task</w:t>
+            </w:r>
+          </w:p>
+        </w:tc>
+      </w:tr>
+      <w:tr>
+        <w:tc>
+          <w:tcPr>
+            <w:tcW w:w="2765" w:type="dxa"/>
+          </w:tcPr>
+          <w:p>
+            <w:pPr>
+              <w:jc w:val="center"/>
+              <w:rPr>
+                <w:rFonts w:ascii="Calibri" w:hAnsi="Calibri" w:cs="Calibri"/>
+                <w:sz w:val="22"/>
+                <w:szCs w:val="22"/>
+                <w:rtl/>
+              </w:rPr>
+            </w:pPr>
+            <w:r>
+              <w:rPr>
+                <w:rFonts w:ascii="Calibri" w:hAnsi="Calibri" w:cs="Calibri"/>
+                <w:sz w:val="22"/>
+                <w:szCs w:val="22"/>
+              </w:rPr>
+              <w:t>1h</w:t>
+            </w:r>
+          </w:p>
+        </w:tc>
+        <w:tc>
+          <w:tcPr>
+            <w:tcW w:w="2765" w:type="dxa"/>
+          </w:tcPr>
+          <w:p>
+            <w:pPr>
+              <w:bidi w:val="0"/>
+              <w:rPr>
+                <w:rFonts w:ascii="Calibri" w:hAnsi="Calibri" w:cs="Calibri"/>
+                <w:sz w:val="22"/>
+                <w:szCs w:val="22"/>
+                <w:rtl/>
+              </w:rPr>
+            </w:pPr>
+            <w:r>
+              <w:rPr>
+                <w:rFonts w:ascii="Calibri" w:hAnsi="Calibri" w:cs="Calibri"/>
+              </w:rPr>
+              <w:t>Everyone</w:t>
+            </w:r>
+          </w:p>
+        </w:tc>
+        <w:tc>
+          <w:tcPr>
+            <w:tcW w:w="2766" w:type="dxa"/>
+          </w:tcPr>
+          <w:p>
+            <w:pPr>
+              <w:bidi w:val="0"/>
+              <w:rPr>
+                <w:rFonts w:ascii="Calibri" w:hAnsi="Calibri" w:cs="Calibri"/>
+                <w:sz w:val="22"/>
+                <w:szCs w:val="22"/>
+              </w:rPr>
+            </w:pPr>
+            <w:r>
+              <w:rPr>
+                <w:rFonts w:ascii="Calibri" w:hAnsi="Calibri" w:cs="Calibri"/>
+                <w:sz w:val="22"/>
+                <w:szCs w:val="22"/>
+              </w:rPr>
+              <w:t>Scrum meeting - Final review and synchronization.</w:t>
+            </w:r>
+          </w:p>
+        </w:tc>
+      </w:tr>
+      <w:tr>
+        <w:tc>
+          <w:tcPr>
+            <w:tcW w:w="2765" w:type="dxa"/>
+          </w:tcPr>
+          <w:p>
+            <w:pPr>
+              <w:bidi w:val="0"/>
+              <w:jc w:val="center"/>
+              <w:rPr>
+                <w:rFonts w:ascii="Calibri" w:hAnsi="Calibri" w:cs="Calibri"/>
+                <w:sz w:val="22"/>
+                <w:szCs w:val="22"/>
+              </w:rPr>
+            </w:pPr>
+            <w:r>
+              <w:rPr>
+                <w:rFonts w:ascii="Calibri" w:hAnsi="Calibri" w:cs="Calibri"/>
+                <w:sz w:val="22"/>
+                <w:szCs w:val="22"/>
+              </w:rPr>
+              <w:t>2h</w:t>
+            </w:r>
+          </w:p>
+        </w:tc>
+        <w:tc>
+          <w:tcPr>
+            <w:tcW w:w="2765" w:type="dxa"/>
+          </w:tcPr>
+          <w:p>
+            <w:pPr>
+              <w:bidi w:val="0"/>
+              <w:rPr>
+                <w:rFonts w:ascii="Calibri" w:hAnsi="Calibri" w:cs="Calibri"/>
+                <w:sz w:val="22"/>
+                <w:szCs w:val="22"/>
+              </w:rPr>
+            </w:pPr>
+            <w:r>
+              <w:rPr>
+                <w:rFonts w:ascii="Calibri" w:hAnsi="Calibri" w:cs="Calibri"/>
+              </w:rPr>
+              <w:t>Everyone</w:t>
+            </w:r>
+          </w:p>
+        </w:tc>
+        <w:tc>
+          <w:tcPr>
+            <w:tcW w:w="2766" w:type="dxa"/>
+          </w:tcPr>
+          <w:p>
+            <w:pPr>
+              <w:bidi w:val="0"/>
+              <w:rPr>
+                <w:rFonts w:ascii="Calibri" w:hAnsi="Calibri" w:cs="Calibri"/>
+                <w:sz w:val="22"/>
+                <w:szCs w:val="22"/>
+                <w:rtl/>
+              </w:rPr>
+            </w:pPr>
+            <w:r>
+              <w:rPr>
+                <w:rFonts w:ascii="Calibri" w:hAnsi="Calibri" w:cs="Calibri"/>
+                <w:sz w:val="22"/>
+                <w:szCs w:val="22"/>
+              </w:rPr>
+              <w:t>Connecting backend to GUI -</w:t>
+            </w:r>
+            <w:r>
+              <w:rPr>
+                <w:rFonts w:ascii="Calibri" w:hAnsi="Calibri" w:cs="Calibri"/>
+              </w:rPr>
+              <w:t xml:space="preserve"> </w:t>
+            </w:r>
+            <w:r>
+              <w:rPr>
+                <w:rFonts w:ascii="Calibri" w:hAnsi="Calibri" w:cs="Calibri"/>
+                <w:sz w:val="22"/>
+                <w:szCs w:val="22"/>
+              </w:rPr>
+              <w:t>Integrating client and server to allow real system flow.</w:t>
+            </w:r>
+          </w:p>
+        </w:tc>
+      </w:tr>
+      <w:tr>
+        <w:tc>
+          <w:tcPr>
+            <w:tcW w:w="2765" w:type="dxa"/>
+          </w:tcPr>
+          <w:p>
+            <w:pPr>
+              <w:bidi w:val="0"/>
+              <w:jc w:val="center"/>
+              <w:rPr>
+                <w:rFonts w:ascii="Calibri" w:hAnsi="Calibri" w:cs="Calibri"/>
+                <w:sz w:val="22"/>
+                <w:szCs w:val="22"/>
+              </w:rPr>
+            </w:pPr>
+            <w:r>
+              <w:rPr>
+                <w:rFonts w:ascii="Calibri" w:hAnsi="Calibri" w:cs="Calibri"/>
+                <w:sz w:val="22"/>
+                <w:szCs w:val="22"/>
+              </w:rPr>
+              <w:t>3</w:t>
+            </w:r>
+            <w:r>
+              <w:rPr>
+                <w:rFonts w:ascii="Calibri" w:hAnsi="Calibri" w:cs="Calibri"/>
+                <w:sz w:val="22"/>
+                <w:szCs w:val="22"/>
+              </w:rPr>
+              <w:t>h</w:t>
+            </w:r>
+          </w:p>
+        </w:tc>
+        <w:tc>
+          <w:tcPr>
+            <w:tcW w:w="2765" w:type="dxa"/>
+          </w:tcPr>
+          <w:p>
+            <w:pPr>
+              <w:bidi w:val="0"/>
+              <w:rPr>
+                <w:rFonts w:ascii="Calibri" w:hAnsi="Calibri" w:cs="Calibri"/>
+                <w:sz w:val="22"/>
+                <w:szCs w:val="22"/>
+              </w:rPr>
+            </w:pPr>
+            <w:r>
+              <w:rPr>
+                <w:rFonts w:ascii="Calibri" w:hAnsi="Calibri" w:cs="Calibri"/>
+              </w:rPr>
+              <w:t>Everyone</w:t>
+            </w:r>
+          </w:p>
+        </w:tc>
+        <w:tc>
+          <w:tcPr>
+            <w:tcW w:w="2766" w:type="dxa"/>
+          </w:tcPr>
+          <w:p>
+            <w:pPr>
+              <w:bidi w:val="0"/>
+              <w:rPr>
+                <w:rFonts w:ascii="Calibri" w:hAnsi="Calibri" w:cs="Calibri"/>
+                <w:sz w:val="22"/>
+                <w:szCs w:val="22"/>
+              </w:rPr>
+            </w:pPr>
+            <w:r>
+              <w:rPr>
+                <w:rFonts w:ascii="Calibri" w:hAnsi="Calibri" w:cs="Calibri"/>
+                <w:sz w:val="22"/>
+                <w:szCs w:val="22"/>
+              </w:rPr>
+              <w:t xml:space="preserve">Updating </w:t>
+            </w:r>
+            <w:r>
+              <w:rPr>
+                <w:rFonts w:ascii="Calibri" w:hAnsi="Calibri" w:cs="Calibri"/>
+                <w:sz w:val="22"/>
+                <w:szCs w:val="22"/>
+              </w:rPr>
+              <w:t>diagrams</w:t>
+            </w:r>
+          </w:p>
+        </w:tc>
+      </w:tr>
+    </w:tbl>
+    <w:p>
+      <w:pPr>
+        <w:bidi w:val="0"/>
+        <w:rPr>
+          <w:rFonts w:ascii="Calibri" w:hAnsi="Calibri" w:cs="Calibri"/>
+          <w:sz w:val="28"/>
+          <w:szCs w:val="28"/>
+          <w:highlight w:val="yellow"/>
+          <w:u w:val="single"/>
+        </w:rPr>
+      </w:pPr>
+    </w:p>
+    <w:p>
+      <w:pPr>
+        <w:bidi w:val="0"/>
+        <w:rPr>
+          <w:rFonts w:ascii="Calibri" w:hAnsi="Calibri" w:cs="Calibri"/>
+          <w:sz w:val="28"/>
+          <w:szCs w:val="28"/>
+          <w:u w:val="single"/>
+        </w:rPr>
+      </w:pPr>
+      <w:r>
+        <w:rPr>
+          <w:rFonts w:ascii="Calibri" w:hAnsi="Calibri" w:cs="Calibri"/>
+          <w:sz w:val="28"/>
+          <w:szCs w:val="28"/>
+          <w:highlight w:val="yellow"/>
+          <w:u w:val="single"/>
+        </w:rPr>
+        <w:t>Total Estimated Effort</w:t>
+      </w:r>
+      <w:proofErr w:type="gramStart"/>
+      <w:r>
+        <w:rPr>
+          <w:rFonts w:ascii="Calibri" w:hAnsi="Calibri" w:cs="Calibri"/>
+          <w:sz w:val="28"/>
+          <w:szCs w:val="28"/>
+          <w:highlight w:val="yellow"/>
+        </w:rPr>
+        <w:t xml:space="preserve">:  </w:t>
+      </w:r>
+      <w:r>
+        <w:rPr>
+          <w:rFonts w:ascii="Calibri" w:hAnsi="Calibri" w:cs="Calibri"/>
+          <w:sz w:val="28"/>
+          <w:szCs w:val="28"/>
+          <w:highlight w:val="yellow"/>
+        </w:rPr>
+        <w:t>4</w:t>
+      </w:r>
+      <w:r>
+        <w:rPr>
+          <w:rFonts w:ascii="Calibri" w:hAnsi="Calibri" w:cs="Calibri"/>
+          <w:sz w:val="28"/>
+          <w:szCs w:val="28"/>
+          <w:highlight w:val="yellow"/>
+        </w:rPr>
+        <w:t>3</w:t>
+      </w:r>
+      <w:proofErr w:type="gramEnd"/>
+      <w:r>
+        <w:rPr>
+          <w:rFonts w:ascii="Calibri" w:hAnsi="Calibri" w:cs="Calibri"/>
+          <w:sz w:val="28"/>
+          <w:szCs w:val="28"/>
+          <w:highlight w:val="yellow"/>
+        </w:rPr>
+        <w:t>H.</w:t>
+      </w:r>
+    </w:p>
+    <w:p>
+      <w:pPr>
+        <w:bidi w:val="0"/>
+        <w:rPr>
+          <w:rFonts w:ascii="Calibri" w:hAnsi="Calibri" w:cs="Calibri"/>
+          <w:sz w:val="22"/>
+          <w:szCs w:val="22"/>
+          <w:u w:val="single"/>
+        </w:rPr>
+      </w:pPr>
+    </w:p>
+    <w:p>
+      <w:pPr>
+        <w:bidi w:val="0"/>
+        <w:rPr>
+          <w:rFonts w:ascii="Calibri" w:hAnsi="Calibri" w:cs="Calibri"/>
+          <w:b/>
+          <w:bCs/>
+          <w:sz w:val="22"/>
+          <w:szCs w:val="22"/>
+          <w:u w:val="single"/>
+          <w:rtl/>
+        </w:rPr>
+      </w:pPr>
     </w:p>
     <w:sectPr>
       <w:pgSz w:w="11906" w:h="16838"/>
@@ -19,20 +2881,72 @@
 </w:document>
 </file>
 
+<file path=word/endnotes.xml><?xml version="1.0" encoding="utf-8"?>
+<w:endnotes xmlns:wpc="http://schemas.microsoft.com/office/word/2010/wordprocessingCanvas" xmlns:cx="http://schemas.microsoft.com/office/drawing/2014/chartex" xmlns:cx1="http://schemas.microsoft.com/office/drawing/2015/9/8/chartex" xmlns:cx2="http://schemas.microsoft.com/office/drawing/2015/10/21/chartex" xmlns:cx3="http://schemas.microsoft.com/office/drawing/2016/5/9/chartex" xmlns:cx4="http://schemas.microsoft.com/office/drawing/2016/5/10/chartex" xmlns:cx5="http://schemas.microsoft.com/office/drawing/2016/5/11/chartex" xmlns:cx6="http://schemas.microsoft.com/office/drawing/2016/5/12/chartex" xmlns:cx7="http://schemas.microsoft.com/office/drawing/2016/5/13/chartex" xmlns:cx8="http://schemas.microsoft.com/office/drawing/2016/5/14/chartex" xmlns:mc="http://schemas.openxmlformats.org/markup-compatibility/2006" xmlns:aink="http://schemas.microsoft.com/office/drawing/2016/ink" xmlns:am3d="http://schemas.microsoft.com/office/drawing/2017/model3d" xmlns:o="urn:schemas-microsoft-com:office:office" xmlns:oel="http://schemas.microsoft.com/office/2019/extlst" xmlns:r="http://schemas.openxmlformats.org/officeDocument/2006/relationships" xmlns:m="http://schemas.openxmlformats.org/officeDocument/2006/math" xmlns:v="urn:schemas-microsoft-com:vml" xmlns:wp14="http://schemas.microsoft.com/office/word/2010/wordprocessingDrawing" xmlns:wp="http://schemas.openxmlformats.org/drawingml/2006/wordprocessingDrawing" xmlns:w10="urn:schemas-microsoft-com:office:word" xmlns:w="http://schemas.openxmlformats.org/wordprocessingml/2006/main" xmlns:w14="http://schemas.microsoft.com/office/word/2010/wordml" xmlns:w15="http://schemas.microsoft.com/office/word/2012/wordml" xmlns:w16cex="http://schemas.microsoft.com/office/word/2018/wordml/cex" xmlns:w16cid="http://schemas.microsoft.com/office/word/2016/wordml/cid" xmlns:w16="http://schemas.microsoft.com/office/word/2018/wordml" xmlns:w16du="http://schemas.microsoft.com/office/word/2023/wordml/word16du" xmlns:w16sdtdh="http://schemas.microsoft.com/office/word/2020/wordml/sdtdatahash" xmlns:w16sdtfl="http://schemas.microsoft.com/office/word/2024/wordml/sdtformatlock" xmlns:w16se="http://schemas.microsoft.com/office/word/2015/wordml/symex" xmlns:wpg="http://schemas.microsoft.com/office/word/2010/wordprocessingGroup" xmlns:wpi="http://schemas.microsoft.com/office/word/2010/wordprocessingInk" xmlns:wne="http://schemas.microsoft.com/office/word/2006/wordml" xmlns:wps="http://schemas.microsoft.com/office/word/2010/wordprocessingShape" mc:Ignorable="w14 w15 w16se w16cid w16 w16cex w16sdtdh w16sdtfl w16du wp14">
+  <w:endnote w:type="separator" w:id="-1">
+    <w:p>
+      <w:pPr>
+        <w:spacing w:after="0" w:line="240" w:lineRule="auto"/>
+      </w:pPr>
+      <w:r>
+        <w:separator/>
+      </w:r>
+    </w:p>
+  </w:endnote>
+  <w:endnote w:type="continuationSeparator" w:id="0">
+    <w:p>
+      <w:pPr>
+        <w:spacing w:after="0" w:line="240" w:lineRule="auto"/>
+      </w:pPr>
+      <w:r>
+        <w:continuationSeparator/>
+      </w:r>
+    </w:p>
+  </w:endnote>
+</w:endnotes>
+</file>
+
+<file path=word/footnotes.xml><?xml version="1.0" encoding="utf-8"?>
+<w:footnotes xmlns:wpc="http://schemas.microsoft.com/office/word/2010/wordprocessingCanvas" xmlns:cx="http://schemas.microsoft.com/office/drawing/2014/chartex" xmlns:cx1="http://schemas.microsoft.com/office/drawing/2015/9/8/chartex" xmlns:cx2="http://schemas.microsoft.com/office/drawing/2015/10/21/chartex" xmlns:cx3="http://schemas.microsoft.com/office/drawing/2016/5/9/chartex" xmlns:cx4="http://schemas.microsoft.com/office/drawing/2016/5/10/chartex" xmlns:cx5="http://schemas.microsoft.com/office/drawing/2016/5/11/chartex" xmlns:cx6="http://schemas.microsoft.com/office/drawing/2016/5/12/chartex" xmlns:cx7="http://schemas.microsoft.com/office/drawing/2016/5/13/chartex" xmlns:cx8="http://schemas.microsoft.com/office/drawing/2016/5/14/chartex" xmlns:mc="http://schemas.openxmlformats.org/markup-compatibility/2006" xmlns:aink="http://schemas.microsoft.com/office/drawing/2016/ink" xmlns:am3d="http://schemas.microsoft.com/office/drawing/2017/model3d" xmlns:o="urn:schemas-microsoft-com:office:office" xmlns:oel="http://schemas.microsoft.com/office/2019/extlst" xmlns:r="http://schemas.openxmlformats.org/officeDocument/2006/relationships" xmlns:m="http://schemas.openxmlformats.org/officeDocument/2006/math" xmlns:v="urn:schemas-microsoft-com:vml" xmlns:wp14="http://schemas.microsoft.com/office/word/2010/wordprocessingDrawing" xmlns:wp="http://schemas.openxmlformats.org/drawingml/2006/wordprocessingDrawing" xmlns:w10="urn:schemas-microsoft-com:office:word" xmlns:w="http://schemas.openxmlformats.org/wordprocessingml/2006/main" xmlns:w14="http://schemas.microsoft.com/office/word/2010/wordml" xmlns:w15="http://schemas.microsoft.com/office/word/2012/wordml" xmlns:w16cex="http://schemas.microsoft.com/office/word/2018/wordml/cex" xmlns:w16cid="http://schemas.microsoft.com/office/word/2016/wordml/cid" xmlns:w16="http://schemas.microsoft.com/office/word/2018/wordml" xmlns:w16du="http://schemas.microsoft.com/office/word/2023/wordml/word16du" xmlns:w16sdtdh="http://schemas.microsoft.com/office/word/2020/wordml/sdtdatahash" xmlns:w16sdtfl="http://schemas.microsoft.com/office/word/2024/wordml/sdtformatlock" xmlns:w16se="http://schemas.microsoft.com/office/word/2015/wordml/symex" xmlns:wpg="http://schemas.microsoft.com/office/word/2010/wordprocessingGroup" xmlns:wpi="http://schemas.microsoft.com/office/word/2010/wordprocessingInk" xmlns:wne="http://schemas.microsoft.com/office/word/2006/wordml" xmlns:wps="http://schemas.microsoft.com/office/word/2010/wordprocessingShape" mc:Ignorable="w14 w15 w16se w16cid w16 w16cex w16sdtdh w16sdtfl w16du wp14">
+  <w:footnote w:type="separator" w:id="-1">
+    <w:p>
+      <w:pPr>
+        <w:spacing w:after="0" w:line="240" w:lineRule="auto"/>
+      </w:pPr>
+      <w:r>
+        <w:separator/>
+      </w:r>
+    </w:p>
+  </w:footnote>
+  <w:footnote w:type="continuationSeparator" w:id="0">
+    <w:p>
+      <w:pPr>
+        <w:spacing w:after="0" w:line="240" w:lineRule="auto"/>
+      </w:pPr>
+      <w:r>
+        <w:continuationSeparator/>
+      </w:r>
+    </w:p>
+  </w:footnote>
+</w:footnotes>
+</file>
+
 <file path=word/styles.xml><?xml version="1.0" encoding="utf-8"?>
 <w:styles xmlns:mc="http://schemas.openxmlformats.org/markup-compatibility/2006" xmlns:r="http://schemas.openxmlformats.org/officeDocument/2006/relationships" xmlns:w="http://schemas.openxmlformats.org/wordprocessingml/2006/main" xmlns:w14="http://schemas.microsoft.com/office/word/2010/wordml" xmlns:w15="http://schemas.microsoft.com/office/word/2012/wordml" xmlns:w16cex="http://schemas.microsoft.com/office/word/2018/wordml/cex" xmlns:w16cid="http://schemas.microsoft.com/office/word/2016/wordml/cid" xmlns:w16="http://schemas.microsoft.com/office/word/2018/wordml" xmlns:w16du="http://schemas.microsoft.com/office/word/2023/wordml/word16du" xmlns:w16sdtdh="http://schemas.microsoft.com/office/word/2020/wordml/sdtdatahash" xmlns:w16sdtfl="http://schemas.microsoft.com/office/word/2024/wordml/sdtformatlock" xmlns:w16se="http://schemas.microsoft.com/office/word/2015/wordml/symex" mc:Ignorable="w14 w15 w16se w16cid w16 w16cex w16sdtdh w16sdtfl w16du">
   <w:docDefaults>
     <w:rPrDefault>
       <w:rPr>
         <w:rFonts w:asciiTheme="minorHAnsi" w:eastAsiaTheme="minorHAnsi" w:hAnsiTheme="minorHAnsi" w:cstheme="minorBidi"/>
-        <w:sz w:val="22"/>
-        <w:szCs w:val="22"/>
+        <w:kern w:val="2"/>
+        <w:sz w:val="24"/>
+        <w:szCs w:val="24"/>
         <w:lang w:val="en-US" w:eastAsia="en-US" w:bidi="he-IL"/>
+        <w14:ligatures w14:val="standardContextual"/>
       </w:rPr>
     </w:rPrDefault>
     <w:pPrDefault>
       <w:pPr>
-        <w:spacing w:after="160" w:line="259" w:lineRule="auto"/>
+        <w:spacing w:after="160" w:line="278" w:lineRule="auto"/>
       </w:pPr>
     </w:pPrDefault>
   </w:docDefaults>
@@ -428,7 +3342,7 @@
     <w:link w:val="10"/>
     <w:uiPriority w:val="9"/>
     <w:qFormat/>
-    <w:rsid w:val="001C723F"/>
+    <w:rsid w:val="009974D2"/>
     <w:pPr>
       <w:keepNext/>
       <w:keepLines/>
@@ -451,7 +3365,7 @@
     <w:semiHidden/>
     <w:unhideWhenUsed/>
     <w:qFormat/>
-    <w:rsid w:val="001C723F"/>
+    <w:rsid w:val="009974D2"/>
     <w:pPr>
       <w:keepNext/>
       <w:keepLines/>
@@ -474,7 +3388,7 @@
     <w:semiHidden/>
     <w:unhideWhenUsed/>
     <w:qFormat/>
-    <w:rsid w:val="001C723F"/>
+    <w:rsid w:val="009974D2"/>
     <w:pPr>
       <w:keepNext/>
       <w:keepLines/>
@@ -497,7 +3411,7 @@
     <w:semiHidden/>
     <w:unhideWhenUsed/>
     <w:qFormat/>
-    <w:rsid w:val="001C723F"/>
+    <w:rsid w:val="009974D2"/>
     <w:pPr>
       <w:keepNext/>
       <w:keepLines/>
@@ -520,7 +3434,7 @@
     <w:semiHidden/>
     <w:unhideWhenUsed/>
     <w:qFormat/>
-    <w:rsid w:val="001C723F"/>
+    <w:rsid w:val="009974D2"/>
     <w:pPr>
       <w:keepNext/>
       <w:keepLines/>
@@ -541,7 +3455,7 @@
     <w:semiHidden/>
     <w:unhideWhenUsed/>
     <w:qFormat/>
-    <w:rsid w:val="001C723F"/>
+    <w:rsid w:val="009974D2"/>
     <w:pPr>
       <w:keepNext/>
       <w:keepLines/>
@@ -564,7 +3478,7 @@
     <w:semiHidden/>
     <w:unhideWhenUsed/>
     <w:qFormat/>
-    <w:rsid w:val="001C723F"/>
+    <w:rsid w:val="009974D2"/>
     <w:pPr>
       <w:keepNext/>
       <w:keepLines/>
@@ -585,7 +3499,7 @@
     <w:semiHidden/>
     <w:unhideWhenUsed/>
     <w:qFormat/>
-    <w:rsid w:val="001C723F"/>
+    <w:rsid w:val="009974D2"/>
     <w:pPr>
       <w:keepNext/>
       <w:keepLines/>
@@ -608,7 +3522,7 @@
     <w:semiHidden/>
     <w:unhideWhenUsed/>
     <w:qFormat/>
-    <w:rsid w:val="001C723F"/>
+    <w:rsid w:val="009974D2"/>
     <w:pPr>
       <w:keepNext/>
       <w:keepLines/>
@@ -623,7 +3537,6 @@
   <w:style w:type="character" w:default="1" w:styleId="a0">
     <w:name w:val="Default Paragraph Font"/>
     <w:uiPriority w:val="1"/>
-    <w:semiHidden/>
     <w:unhideWhenUsed/>
   </w:style>
   <w:style w:type="table" w:default="1" w:styleId="a1">
@@ -652,7 +3565,7 @@
     <w:basedOn w:val="a0"/>
     <w:link w:val="1"/>
     <w:uiPriority w:val="9"/>
-    <w:rsid w:val="001C723F"/>
+    <w:rsid w:val="009974D2"/>
     <w:rPr>
       <w:rFonts w:asciiTheme="majorHAnsi" w:eastAsiaTheme="majorEastAsia" w:hAnsiTheme="majorHAnsi" w:cstheme="majorBidi"/>
       <w:color w:val="0F4761" w:themeColor="accent1" w:themeShade="BF"/>
@@ -666,7 +3579,7 @@
     <w:link w:val="2"/>
     <w:uiPriority w:val="9"/>
     <w:semiHidden/>
-    <w:rsid w:val="001C723F"/>
+    <w:rsid w:val="009974D2"/>
     <w:rPr>
       <w:rFonts w:asciiTheme="majorHAnsi" w:eastAsiaTheme="majorEastAsia" w:hAnsiTheme="majorHAnsi" w:cstheme="majorBidi"/>
       <w:color w:val="0F4761" w:themeColor="accent1" w:themeShade="BF"/>
@@ -680,7 +3593,7 @@
     <w:link w:val="3"/>
     <w:uiPriority w:val="9"/>
     <w:semiHidden/>
-    <w:rsid w:val="001C723F"/>
+    <w:rsid w:val="009974D2"/>
     <w:rPr>
       <w:rFonts w:eastAsiaTheme="majorEastAsia" w:cstheme="majorBidi"/>
       <w:color w:val="0F4761" w:themeColor="accent1" w:themeShade="BF"/>
@@ -694,7 +3607,7 @@
     <w:link w:val="4"/>
     <w:uiPriority w:val="9"/>
     <w:semiHidden/>
-    <w:rsid w:val="001C723F"/>
+    <w:rsid w:val="009974D2"/>
     <w:rPr>
       <w:rFonts w:eastAsiaTheme="majorEastAsia" w:cstheme="majorBidi"/>
       <w:i/>
@@ -708,7 +3621,7 @@
     <w:link w:val="5"/>
     <w:uiPriority w:val="9"/>
     <w:semiHidden/>
-    <w:rsid w:val="001C723F"/>
+    <w:rsid w:val="009974D2"/>
     <w:rPr>
       <w:rFonts w:eastAsiaTheme="majorEastAsia" w:cstheme="majorBidi"/>
       <w:color w:val="0F4761" w:themeColor="accent1" w:themeShade="BF"/>
@@ -720,7 +3633,7 @@
     <w:link w:val="6"/>
     <w:uiPriority w:val="9"/>
     <w:semiHidden/>
-    <w:rsid w:val="001C723F"/>
+    <w:rsid w:val="009974D2"/>
     <w:rPr>
       <w:rFonts w:eastAsiaTheme="majorEastAsia" w:cstheme="majorBidi"/>
       <w:i/>
@@ -734,7 +3647,7 @@
     <w:link w:val="7"/>
     <w:uiPriority w:val="9"/>
     <w:semiHidden/>
-    <w:rsid w:val="001C723F"/>
+    <w:rsid w:val="009974D2"/>
     <w:rPr>
       <w:rFonts w:eastAsiaTheme="majorEastAsia" w:cstheme="majorBidi"/>
       <w:color w:val="595959" w:themeColor="text1" w:themeTint="A6"/>
@@ -746,7 +3659,7 @@
     <w:link w:val="8"/>
     <w:uiPriority w:val="9"/>
     <w:semiHidden/>
-    <w:rsid w:val="001C723F"/>
+    <w:rsid w:val="009974D2"/>
     <w:rPr>
       <w:rFonts w:eastAsiaTheme="majorEastAsia" w:cstheme="majorBidi"/>
       <w:i/>
@@ -760,7 +3673,7 @@
     <w:link w:val="9"/>
     <w:uiPriority w:val="9"/>
     <w:semiHidden/>
-    <w:rsid w:val="001C723F"/>
+    <w:rsid w:val="009974D2"/>
     <w:rPr>
       <w:rFonts w:eastAsiaTheme="majorEastAsia" w:cstheme="majorBidi"/>
       <w:color w:val="272727" w:themeColor="text1" w:themeTint="D8"/>
@@ -773,7 +3686,7 @@
     <w:link w:val="a4"/>
     <w:uiPriority w:val="10"/>
     <w:qFormat/>
-    <w:rsid w:val="001C723F"/>
+    <w:rsid w:val="009974D2"/>
     <w:pPr>
       <w:spacing w:after="80" w:line="240" w:lineRule="auto"/>
       <w:contextualSpacing/>
@@ -791,7 +3704,7 @@
     <w:basedOn w:val="a0"/>
     <w:link w:val="a3"/>
     <w:uiPriority w:val="10"/>
-    <w:rsid w:val="001C723F"/>
+    <w:rsid w:val="009974D2"/>
     <w:rPr>
       <w:rFonts w:asciiTheme="majorHAnsi" w:eastAsiaTheme="majorEastAsia" w:hAnsiTheme="majorHAnsi" w:cstheme="majorBidi"/>
       <w:spacing w:val="-10"/>
@@ -807,7 +3720,7 @@
     <w:link w:val="a6"/>
     <w:uiPriority w:val="11"/>
     <w:qFormat/>
-    <w:rsid w:val="001C723F"/>
+    <w:rsid w:val="009974D2"/>
     <w:pPr>
       <w:numPr>
         <w:ilvl w:val="1"/>
@@ -826,7 +3739,7 @@
     <w:basedOn w:val="a0"/>
     <w:link w:val="a5"/>
     <w:uiPriority w:val="11"/>
-    <w:rsid w:val="001C723F"/>
+    <w:rsid w:val="009974D2"/>
     <w:rPr>
       <w:rFonts w:eastAsiaTheme="majorEastAsia" w:cstheme="majorBidi"/>
       <w:color w:val="595959" w:themeColor="text1" w:themeTint="A6"/>
@@ -842,7 +3755,7 @@
     <w:link w:val="a8"/>
     <w:uiPriority w:val="29"/>
     <w:qFormat/>
-    <w:rsid w:val="001C723F"/>
+    <w:rsid w:val="009974D2"/>
     <w:pPr>
       <w:spacing w:before="160"/>
       <w:jc w:val="center"/>
@@ -858,7 +3771,7 @@
     <w:basedOn w:val="a0"/>
     <w:link w:val="a7"/>
     <w:uiPriority w:val="29"/>
-    <w:rsid w:val="001C723F"/>
+    <w:rsid w:val="009974D2"/>
     <w:rPr>
       <w:i/>
       <w:iCs/>
@@ -870,7 +3783,7 @@
     <w:basedOn w:val="a"/>
     <w:uiPriority w:val="34"/>
     <w:qFormat/>
-    <w:rsid w:val="001C723F"/>
+    <w:rsid w:val="009974D2"/>
     <w:pPr>
       <w:ind w:left="720"/>
       <w:contextualSpacing/>
@@ -881,7 +3794,7 @@
     <w:basedOn w:val="a0"/>
     <w:uiPriority w:val="21"/>
     <w:qFormat/>
-    <w:rsid w:val="001C723F"/>
+    <w:rsid w:val="009974D2"/>
     <w:rPr>
       <w:i/>
       <w:iCs/>
@@ -895,7 +3808,7 @@
     <w:link w:val="ac"/>
     <w:uiPriority w:val="30"/>
     <w:qFormat/>
-    <w:rsid w:val="001C723F"/>
+    <w:rsid w:val="009974D2"/>
     <w:pPr>
       <w:pBdr>
         <w:top w:val="single" w:sz="4" w:space="10" w:color="0F4761" w:themeColor="accent1" w:themeShade="BF"/>
@@ -916,7 +3829,7 @@
     <w:basedOn w:val="a0"/>
     <w:link w:val="ab"/>
     <w:uiPriority w:val="30"/>
-    <w:rsid w:val="001C723F"/>
+    <w:rsid w:val="009974D2"/>
     <w:rPr>
       <w:i/>
       <w:iCs/>
@@ -928,13 +3841,114 @@
     <w:basedOn w:val="a0"/>
     <w:uiPriority w:val="32"/>
     <w:qFormat/>
-    <w:rsid w:val="001C723F"/>
+    <w:rsid w:val="009974D2"/>
     <w:rPr>
       <w:b/>
       <w:bCs/>
       <w:smallCaps/>
       <w:color w:val="0F4761" w:themeColor="accent1" w:themeShade="BF"/>
       <w:spacing w:val="5"/>
+    </w:rPr>
+  </w:style>
+  <w:style w:type="paragraph" w:styleId="ae">
+    <w:name w:val="header"/>
+    <w:basedOn w:val="a"/>
+    <w:link w:val="af"/>
+    <w:uiPriority w:val="99"/>
+    <w:unhideWhenUsed/>
+    <w:rsid w:val="009974D2"/>
+    <w:pPr>
+      <w:tabs>
+        <w:tab w:val="center" w:pos="4153"/>
+        <w:tab w:val="right" w:pos="8306"/>
+      </w:tabs>
+      <w:spacing w:after="0" w:line="240" w:lineRule="auto"/>
+    </w:pPr>
+  </w:style>
+  <w:style w:type="character" w:customStyle="1" w:styleId="af">
+    <w:name w:val="כותרת עליונה תו"/>
+    <w:basedOn w:val="a0"/>
+    <w:link w:val="ae"/>
+    <w:uiPriority w:val="99"/>
+    <w:rsid w:val="009974D2"/>
+  </w:style>
+  <w:style w:type="paragraph" w:styleId="af0">
+    <w:name w:val="footer"/>
+    <w:basedOn w:val="a"/>
+    <w:link w:val="af1"/>
+    <w:uiPriority w:val="99"/>
+    <w:unhideWhenUsed/>
+    <w:rsid w:val="009974D2"/>
+    <w:pPr>
+      <w:tabs>
+        <w:tab w:val="center" w:pos="4153"/>
+        <w:tab w:val="right" w:pos="8306"/>
+      </w:tabs>
+      <w:spacing w:after="0" w:line="240" w:lineRule="auto"/>
+    </w:pPr>
+  </w:style>
+  <w:style w:type="character" w:customStyle="1" w:styleId="af1">
+    <w:name w:val="כותרת תחתונה תו"/>
+    <w:basedOn w:val="a0"/>
+    <w:link w:val="af0"/>
+    <w:uiPriority w:val="99"/>
+    <w:rsid w:val="009974D2"/>
+  </w:style>
+  <w:style w:type="table" w:styleId="af2">
+    <w:name w:val="Table Grid"/>
+    <w:basedOn w:val="a1"/>
+    <w:uiPriority w:val="39"/>
+    <w:rsid w:val="00547289"/>
+    <w:pPr>
+      <w:spacing w:after="0" w:line="240" w:lineRule="auto"/>
+    </w:pPr>
+    <w:tblPr>
+      <w:tblBorders>
+        <w:top w:val="single" w:sz="4" w:space="0" w:color="auto"/>
+        <w:left w:val="single" w:sz="4" w:space="0" w:color="auto"/>
+        <w:bottom w:val="single" w:sz="4" w:space="0" w:color="auto"/>
+        <w:right w:val="single" w:sz="4" w:space="0" w:color="auto"/>
+        <w:insideH w:val="single" w:sz="4" w:space="0" w:color="auto"/>
+        <w:insideV w:val="single" w:sz="4" w:space="0" w:color="auto"/>
+      </w:tblBorders>
+    </w:tblPr>
+  </w:style>
+  <w:style w:type="paragraph" w:customStyle="1" w:styleId="p1">
+    <w:name w:val="p1"/>
+    <w:basedOn w:val="a"/>
+    <w:rsid w:val="00FF12B9"/>
+    <w:pPr>
+      <w:bidi w:val="0"/>
+      <w:spacing w:before="100" w:beforeAutospacing="1" w:after="100" w:afterAutospacing="1" w:line="240" w:lineRule="auto"/>
+    </w:pPr>
+    <w:rPr>
+      <w:rFonts w:ascii="Times New Roman" w:eastAsia="Times New Roman" w:hAnsi="Times New Roman" w:cs="Times New Roman"/>
+      <w:kern w:val="0"/>
+      <w:lang/>
+      <w14:ligatures w14:val="none"/>
+    </w:rPr>
+  </w:style>
+  <w:style w:type="character" w:styleId="Hyperlink">
+    <w:name w:val="Hyperlink"/>
+    <w:basedOn w:val="a0"/>
+    <w:uiPriority w:val="99"/>
+    <w:unhideWhenUsed/>
+    <w:rsid w:val="004805C6"/>
+    <w:rPr>
+      <w:color w:val="467886" w:themeColor="hyperlink"/>
+      <w:u w:val="single"/>
+    </w:rPr>
+  </w:style>
+  <w:style w:type="character" w:styleId="af3">
+    <w:name w:val="Unresolved Mention"/>
+    <w:basedOn w:val="a0"/>
+    <w:uiPriority w:val="99"/>
+    <w:semiHidden/>
+    <w:unhideWhenUsed/>
+    <w:rsid w:val="004805C6"/>
+    <w:rPr>
+      <w:color w:val="605E5C"/>
+      <w:shd w:val="clear" w:color="auto" w:fill="E1DFDD"/>
     </w:rPr>
   </w:style>
 </w:styles>
@@ -1038,7 +4052,7 @@
         <a:latin typeface="Aptos" panose="02110004020202020204"/>
         <a:ea typeface=""/>
         <a:cs typeface=""/>
-        <a:font script="Jpan" typeface="游ゴシック"/>
+        <a:font script="Jpan" typeface="游明朝"/>
         <a:font script="Hang" typeface="맑은 고딕"/>
         <a:font script="Hans" typeface="等线"/>
         <a:font script="Hant" typeface="新細明體"/>
@@ -1229,7 +4243,7 @@
   <a:extraClrSchemeLst/>
   <a:extLst>
     <a:ext uri="{05A4C25C-085E-4340-85A3-A5531E510DB2}">
-      <thm15:themeFamily xmlns:thm15="http://schemas.microsoft.com/office/thememl/2012/main" name="Office Theme" id="{62F939B6-93AF-4DB8-9C6B-D6C7DFDC589F}" vid="{4A3C46E8-61CC-4603-A589-7422A47A8E4A}"/>
+      <thm15:themeFamily xmlns:thm15="http://schemas.microsoft.com/office/thememl/2012/main" name="Office Theme" id="{2E142A2C-CD16-42D6-873A-C26D2A0506FA}" vid="{1BDDFF52-6CD6-40A5-AB3C-68EB2F1E4D0A}"/>
     </a:ext>
   </a:extLst>
 </a:theme>

</xml_diff>